<commit_message>
docs: livraison du lot 2 (moteur) ; édition régénérée (2 078 pages) avec le fichier projet et un RSNat écrit par le moteur
</commit_message>
<xml_diff>
--- a/livraison/Méthode de calcul OpenNAT v1.docx
+++ b/livraison/Méthode de calcul OpenNAT v1.docx
@@ -10312,7 +10312,49 @@
           <w:rFonts w:ascii="Calibri" w:hAnsi="Calibri"/>
           <w:sz w:val="20"/>
         </w:rPr>
-        <w:t xml:space="preserve">Un fichier XML, validé par un schéma XSD publié avec la méthode, et sa copie JSON. Sa structure reprend celle du RSEE : un bloc </w:t>
+        <w:t>Un fichier XML, validé par un schéma XSD publié avec la méthode (</w:t>
+      </w:r>
+      <w:r>
+        <w:rPr>
+          <w:rFonts w:ascii="Calibri" w:hAnsi="Calibri"/>
+          <w:sz w:val="20"/>
+        </w:rPr>
+        <w:t>schemas/rsnat.xsd</w:t>
+      </w:r>
+      <w:r>
+        <w:rPr>
+          <w:rFonts w:ascii="Calibri" w:hAnsi="Calibri"/>
+          <w:sz w:val="20"/>
+        </w:rPr>
+        <w:t>), et sa copie JSON, validée par son schéma JSON (</w:t>
+      </w:r>
+      <w:r>
+        <w:rPr>
+          <w:rFonts w:ascii="Calibri" w:hAnsi="Calibri"/>
+          <w:sz w:val="20"/>
+        </w:rPr>
+        <w:t>schemas/rsnat.schema.json</w:t>
+      </w:r>
+      <w:r>
+        <w:rPr>
+          <w:rFonts w:ascii="Calibri" w:hAnsi="Calibri"/>
+          <w:sz w:val="20"/>
+        </w:rPr>
+        <w:t>). Le fichier projet, en entrée du moteur, a lui aussi son schéma (</w:t>
+      </w:r>
+      <w:r>
+        <w:rPr>
+          <w:rFonts w:ascii="Calibri" w:hAnsi="Calibri"/>
+          <w:sz w:val="20"/>
+        </w:rPr>
+        <w:t>schemas/projet.schema.json</w:t>
+      </w:r>
+      <w:r>
+        <w:rPr>
+          <w:rFonts w:ascii="Calibri" w:hAnsi="Calibri"/>
+          <w:sz w:val="20"/>
+        </w:rPr>
+        <w:t xml:space="preserve">). Sa structure reprend celle du RSEE : un bloc </w:t>
       </w:r>
       <w:r>
         <w:rPr>
@@ -11840,7 +11882,7 @@
                 <w:rFonts w:ascii="Calibri" w:hAnsi="Calibri"/>
                 <w:sz w:val="20"/>
               </w:rPr>
-              <w:t>seuils proposés</w:t>
+              <w:t>seuils proposés, bornes des classes d'emprise</w:t>
             </w:r>
           </w:p>
         </w:tc>
@@ -11853,6 +11895,65 @@
             <w:pPr>
               <w:spacing w:before="79" w:after="79" w:line="276" w:lineRule="auto"/>
             </w:pPr>
+          </w:p>
+        </w:tc>
+      </w:tr>
+      <w:tr>
+        <w:trPr>
+          <w:cantSplit/>
+        </w:trPr>
+        <w:tc>
+          <w:tcPr>
+            <w:tcW w:type="dxa" w:w="2536"/>
+            <w:vAlign w:val="center"/>
+          </w:tcPr>
+          <w:p>
+            <w:pPr>
+              <w:spacing w:before="79" w:after="79" w:line="276" w:lineRule="auto"/>
+            </w:pPr>
+            <w:r>
+              <w:rPr>
+                <w:rFonts w:ascii="Calibri" w:hAnsi="Calibri"/>
+                <w:sz w:val="20"/>
+              </w:rPr>
+              <w:t>constantes.csv</w:t>
+            </w:r>
+          </w:p>
+        </w:tc>
+        <w:tc>
+          <w:tcPr>
+            <w:tcW w:type="dxa" w:w="3551"/>
+            <w:vAlign w:val="center"/>
+          </w:tcPr>
+          <w:p>
+            <w:pPr>
+              <w:spacing w:before="79" w:after="79" w:line="276" w:lineRule="auto"/>
+            </w:pPr>
+            <w:r>
+              <w:rPr>
+                <w:rFonts w:ascii="Calibri" w:hAnsi="Calibri"/>
+                <w:sz w:val="20"/>
+              </w:rPr>
+              <w:t>constantes des équations publiées (FAO-56, ISO 2533), valeurs de règle des modules dynamiques, seuils de contrôle</w:t>
+            </w:r>
+          </w:p>
+        </w:tc>
+        <w:tc>
+          <w:tcPr>
+            <w:tcW w:type="dxa" w:w="3551"/>
+            <w:vAlign w:val="center"/>
+          </w:tcPr>
+          <w:p>
+            <w:pPr>
+              <w:spacing w:before="79" w:after="79" w:line="276" w:lineRule="auto"/>
+            </w:pPr>
+            <w:r>
+              <w:rPr>
+                <w:rFonts w:ascii="Calibri" w:hAnsi="Calibri"/>
+                <w:sz w:val="20"/>
+              </w:rPr>
+              <w:t>outils/construire_constantes.py</w:t>
+            </w:r>
           </w:p>
         </w:tc>
       </w:tr>

</xml_diff>

<commit_message>
feat(banc): lot 4, banc de validation et documentation ; moteur 0.2.0, données 1.2.1
- banc des huit situations du cahier des charges et de 60 cas complémentaires, fiche du banc (banc/README.md)
- non-régression : 38 930 grandeurs figées (banc/regression.py, regression.json), empreinte des tables liée au journal des versions
- 20 tests de propriétés (tests/test_proprietes.py)
- contrôle dimensionnel automatique, exigence E12 (opennat/dimensions.py), appelé par opennat controle
- correction relevée par ce contrôle : unité du facteur climat, m²HE par kg CO2 éq. (valeur et résultats inchangés)
- contrôle d'ordre de grandeur du module G face à l'étude Carbone 4 (banc/carbone4.py, note, section de la partie 8)
- guide utilisateur, guide du contributeur, journal des versions, en Word et PDF au papier NORMATYS
- convertisseur Word : tableaux courts d'un bloc, phrase d'annonce liée à ce qui suit
</commit_message>
<xml_diff>
--- a/livraison/Méthode de calcul OpenNAT v1.docx
+++ b/livraison/Méthode de calcul OpenNAT v1.docx
@@ -239,6 +239,7 @@
     </w:p>
     <w:p>
       <w:pPr>
+        <w:keepNext/>
         <w:spacing w:before="57" w:after="227" w:line="288" w:lineRule="auto"/>
       </w:pPr>
       <w:r>
@@ -284,6 +285,7 @@
           </w:tcPr>
           <w:p>
             <w:pPr>
+              <w:keepNext/>
               <w:spacing w:before="79" w:after="79" w:line="276" w:lineRule="auto"/>
             </w:pPr>
             <w:r>
@@ -305,6 +307,7 @@
           </w:tcPr>
           <w:p>
             <w:pPr>
+              <w:keepNext/>
               <w:spacing w:before="79" w:after="79" w:line="276" w:lineRule="auto"/>
             </w:pPr>
             <w:r>
@@ -326,6 +329,7 @@
           </w:tcPr>
           <w:p>
             <w:pPr>
+              <w:keepNext/>
               <w:spacing w:before="79" w:after="79" w:line="276" w:lineRule="auto"/>
             </w:pPr>
             <w:r>
@@ -347,6 +351,7 @@
           </w:tcPr>
           <w:p>
             <w:pPr>
+              <w:keepNext/>
               <w:spacing w:before="79" w:after="79" w:line="276" w:lineRule="auto"/>
             </w:pPr>
             <w:r>
@@ -372,6 +377,7 @@
           </w:tcPr>
           <w:p>
             <w:pPr>
+              <w:keepNext/>
               <w:spacing w:before="79" w:after="79" w:line="276" w:lineRule="auto"/>
             </w:pPr>
             <w:r>
@@ -390,6 +396,7 @@
           </w:tcPr>
           <w:p>
             <w:pPr>
+              <w:keepNext/>
               <w:spacing w:before="79" w:after="79" w:line="276" w:lineRule="auto"/>
             </w:pPr>
             <w:r>
@@ -408,6 +415,7 @@
           </w:tcPr>
           <w:p>
             <w:pPr>
+              <w:keepNext/>
               <w:spacing w:before="79" w:after="79" w:line="276" w:lineRule="auto"/>
             </w:pPr>
             <w:r>
@@ -426,6 +434,7 @@
           </w:tcPr>
           <w:p>
             <w:pPr>
+              <w:keepNext/>
               <w:spacing w:before="79" w:after="79" w:line="276" w:lineRule="auto"/>
             </w:pPr>
             <w:r>
@@ -449,6 +458,7 @@
           </w:tcPr>
           <w:p>
             <w:pPr>
+              <w:keepNext/>
               <w:spacing w:before="79" w:after="79" w:line="276" w:lineRule="auto"/>
             </w:pPr>
             <w:r>
@@ -467,6 +477,7 @@
           </w:tcPr>
           <w:p>
             <w:pPr>
+              <w:keepNext/>
               <w:spacing w:before="79" w:after="79" w:line="276" w:lineRule="auto"/>
             </w:pPr>
             <w:r>
@@ -485,6 +496,7 @@
           </w:tcPr>
           <w:p>
             <w:pPr>
+              <w:keepNext/>
               <w:spacing w:before="79" w:after="79" w:line="276" w:lineRule="auto"/>
             </w:pPr>
             <w:r>
@@ -503,6 +515,7 @@
           </w:tcPr>
           <w:p>
             <w:pPr>
+              <w:keepNext/>
               <w:spacing w:before="79" w:after="79" w:line="276" w:lineRule="auto"/>
             </w:pPr>
             <w:r>
@@ -526,6 +539,7 @@
           </w:tcPr>
           <w:p>
             <w:pPr>
+              <w:keepNext/>
               <w:spacing w:before="79" w:after="79" w:line="276" w:lineRule="auto"/>
             </w:pPr>
             <w:r>
@@ -544,6 +558,7 @@
           </w:tcPr>
           <w:p>
             <w:pPr>
+              <w:keepNext/>
               <w:spacing w:before="79" w:after="79" w:line="276" w:lineRule="auto"/>
             </w:pPr>
             <w:r>
@@ -562,6 +577,7 @@
           </w:tcPr>
           <w:p>
             <w:pPr>
+              <w:keepNext/>
               <w:spacing w:before="79" w:after="79" w:line="276" w:lineRule="auto"/>
             </w:pPr>
             <w:r>
@@ -580,6 +596,7 @@
           </w:tcPr>
           <w:p>
             <w:pPr>
+              <w:keepNext/>
               <w:spacing w:before="79" w:after="79" w:line="276" w:lineRule="auto"/>
             </w:pPr>
             <w:r>
@@ -865,9 +882,9 @@
         <w:tblLayout w:type="fixed"/>
       </w:tblPr>
       <w:tblGrid>
-        <w:gridCol w:w="1791"/>
-        <w:gridCol w:w="4434"/>
-        <w:gridCol w:w="3411"/>
+        <w:gridCol w:w="1921"/>
+        <w:gridCol w:w="4755"/>
+        <w:gridCol w:w="2961"/>
       </w:tblGrid>
       <w:tr>
         <w:trPr>
@@ -876,7 +893,7 @@
         </w:trPr>
         <w:tc>
           <w:tcPr>
-            <w:tcW w:type="dxa" w:w="1792"/>
+            <w:tcW w:type="dxa" w:w="1921"/>
             <w:vAlign w:val="center"/>
             <w:shd w:val="clear" w:color="auto" w:fill="202335"/>
           </w:tcPr>
@@ -897,7 +914,7 @@
         </w:tc>
         <w:tc>
           <w:tcPr>
-            <w:tcW w:type="dxa" w:w="4434"/>
+            <w:tcW w:type="dxa" w:w="4755"/>
             <w:vAlign w:val="center"/>
             <w:shd w:val="clear" w:color="auto" w:fill="202335"/>
           </w:tcPr>
@@ -918,7 +935,7 @@
         </w:tc>
         <w:tc>
           <w:tcPr>
-            <w:tcW w:type="dxa" w:w="3411"/>
+            <w:tcW w:type="dxa" w:w="2961"/>
             <w:vAlign w:val="center"/>
             <w:shd w:val="clear" w:color="auto" w:fill="202335"/>
           </w:tcPr>
@@ -944,7 +961,7 @@
         </w:trPr>
         <w:tc>
           <w:tcPr>
-            <w:tcW w:type="dxa" w:w="1792"/>
+            <w:tcW w:type="dxa" w:w="1921"/>
             <w:vAlign w:val="center"/>
           </w:tcPr>
           <w:p>
@@ -962,7 +979,7 @@
         </w:tc>
         <w:tc>
           <w:tcPr>
-            <w:tcW w:type="dxa" w:w="4434"/>
+            <w:tcW w:type="dxa" w:w="4755"/>
             <w:vAlign w:val="center"/>
           </w:tcPr>
           <w:p>
@@ -980,7 +997,7 @@
         </w:tc>
         <w:tc>
           <w:tcPr>
-            <w:tcW w:type="dxa" w:w="3411"/>
+            <w:tcW w:type="dxa" w:w="2961"/>
             <w:vAlign w:val="center"/>
           </w:tcPr>
           <w:p>
@@ -1003,7 +1020,7 @@
         </w:trPr>
         <w:tc>
           <w:tcPr>
-            <w:tcW w:type="dxa" w:w="1792"/>
+            <w:tcW w:type="dxa" w:w="1921"/>
             <w:vAlign w:val="center"/>
           </w:tcPr>
           <w:p>
@@ -1021,7 +1038,7 @@
         </w:tc>
         <w:tc>
           <w:tcPr>
-            <w:tcW w:type="dxa" w:w="4434"/>
+            <w:tcW w:type="dxa" w:w="4755"/>
             <w:vAlign w:val="center"/>
           </w:tcPr>
           <w:p>
@@ -1039,7 +1056,7 @@
         </w:tc>
         <w:tc>
           <w:tcPr>
-            <w:tcW w:type="dxa" w:w="3411"/>
+            <w:tcW w:type="dxa" w:w="2961"/>
             <w:vAlign w:val="center"/>
           </w:tcPr>
           <w:p>
@@ -1062,7 +1079,7 @@
         </w:trPr>
         <w:tc>
           <w:tcPr>
-            <w:tcW w:type="dxa" w:w="1792"/>
+            <w:tcW w:type="dxa" w:w="1921"/>
             <w:vAlign w:val="center"/>
           </w:tcPr>
           <w:p>
@@ -1080,7 +1097,7 @@
         </w:tc>
         <w:tc>
           <w:tcPr>
-            <w:tcW w:type="dxa" w:w="4434"/>
+            <w:tcW w:type="dxa" w:w="4755"/>
             <w:vAlign w:val="center"/>
           </w:tcPr>
           <w:p>
@@ -1098,7 +1115,7 @@
         </w:tc>
         <w:tc>
           <w:tcPr>
-            <w:tcW w:type="dxa" w:w="3411"/>
+            <w:tcW w:type="dxa" w:w="2961"/>
             <w:vAlign w:val="center"/>
           </w:tcPr>
           <w:p>
@@ -1121,7 +1138,7 @@
         </w:trPr>
         <w:tc>
           <w:tcPr>
-            <w:tcW w:type="dxa" w:w="1792"/>
+            <w:tcW w:type="dxa" w:w="1921"/>
             <w:vAlign w:val="center"/>
           </w:tcPr>
           <w:p>
@@ -1139,7 +1156,7 @@
         </w:tc>
         <w:tc>
           <w:tcPr>
-            <w:tcW w:type="dxa" w:w="4434"/>
+            <w:tcW w:type="dxa" w:w="4755"/>
             <w:vAlign w:val="center"/>
           </w:tcPr>
           <w:p>
@@ -1157,7 +1174,7 @@
         </w:tc>
         <w:tc>
           <w:tcPr>
-            <w:tcW w:type="dxa" w:w="3411"/>
+            <w:tcW w:type="dxa" w:w="2961"/>
             <w:vAlign w:val="center"/>
           </w:tcPr>
           <w:p>
@@ -1180,7 +1197,7 @@
         </w:trPr>
         <w:tc>
           <w:tcPr>
-            <w:tcW w:type="dxa" w:w="1792"/>
+            <w:tcW w:type="dxa" w:w="1921"/>
             <w:vAlign w:val="center"/>
           </w:tcPr>
           <w:p>
@@ -1198,7 +1215,7 @@
         </w:tc>
         <w:tc>
           <w:tcPr>
-            <w:tcW w:type="dxa" w:w="4434"/>
+            <w:tcW w:type="dxa" w:w="4755"/>
             <w:vAlign w:val="center"/>
           </w:tcPr>
           <w:p>
@@ -1216,7 +1233,7 @@
         </w:tc>
         <w:tc>
           <w:tcPr>
-            <w:tcW w:type="dxa" w:w="3411"/>
+            <w:tcW w:type="dxa" w:w="2961"/>
             <w:vAlign w:val="center"/>
           </w:tcPr>
           <w:p>
@@ -1239,7 +1256,7 @@
         </w:trPr>
         <w:tc>
           <w:tcPr>
-            <w:tcW w:type="dxa" w:w="1792"/>
+            <w:tcW w:type="dxa" w:w="1921"/>
             <w:vAlign w:val="center"/>
           </w:tcPr>
           <w:p>
@@ -1257,7 +1274,7 @@
         </w:tc>
         <w:tc>
           <w:tcPr>
-            <w:tcW w:type="dxa" w:w="4434"/>
+            <w:tcW w:type="dxa" w:w="4755"/>
             <w:vAlign w:val="center"/>
           </w:tcPr>
           <w:p>
@@ -1275,7 +1292,7 @@
         </w:tc>
         <w:tc>
           <w:tcPr>
-            <w:tcW w:type="dxa" w:w="3411"/>
+            <w:tcW w:type="dxa" w:w="2961"/>
             <w:vAlign w:val="center"/>
           </w:tcPr>
           <w:p>
@@ -1298,7 +1315,7 @@
         </w:trPr>
         <w:tc>
           <w:tcPr>
-            <w:tcW w:type="dxa" w:w="1792"/>
+            <w:tcW w:type="dxa" w:w="1921"/>
             <w:vAlign w:val="center"/>
           </w:tcPr>
           <w:p>
@@ -1316,7 +1333,7 @@
         </w:tc>
         <w:tc>
           <w:tcPr>
-            <w:tcW w:type="dxa" w:w="4434"/>
+            <w:tcW w:type="dxa" w:w="4755"/>
             <w:vAlign w:val="center"/>
           </w:tcPr>
           <w:p>
@@ -1334,7 +1351,7 @@
         </w:tc>
         <w:tc>
           <w:tcPr>
-            <w:tcW w:type="dxa" w:w="3411"/>
+            <w:tcW w:type="dxa" w:w="2961"/>
             <w:vAlign w:val="center"/>
           </w:tcPr>
           <w:p>
@@ -1357,7 +1374,7 @@
         </w:trPr>
         <w:tc>
           <w:tcPr>
-            <w:tcW w:type="dxa" w:w="1792"/>
+            <w:tcW w:type="dxa" w:w="1921"/>
             <w:vAlign w:val="center"/>
           </w:tcPr>
           <w:p>
@@ -1375,7 +1392,7 @@
         </w:tc>
         <w:tc>
           <w:tcPr>
-            <w:tcW w:type="dxa" w:w="4434"/>
+            <w:tcW w:type="dxa" w:w="4755"/>
             <w:vAlign w:val="center"/>
           </w:tcPr>
           <w:p>
@@ -1393,7 +1410,7 @@
         </w:tc>
         <w:tc>
           <w:tcPr>
-            <w:tcW w:type="dxa" w:w="3411"/>
+            <w:tcW w:type="dxa" w:w="2961"/>
             <w:vAlign w:val="center"/>
           </w:tcPr>
           <w:p>
@@ -1416,7 +1433,7 @@
         </w:trPr>
         <w:tc>
           <w:tcPr>
-            <w:tcW w:type="dxa" w:w="1792"/>
+            <w:tcW w:type="dxa" w:w="1921"/>
             <w:vAlign w:val="center"/>
           </w:tcPr>
           <w:p>
@@ -1434,7 +1451,7 @@
         </w:tc>
         <w:tc>
           <w:tcPr>
-            <w:tcW w:type="dxa" w:w="4434"/>
+            <w:tcW w:type="dxa" w:w="4755"/>
             <w:vAlign w:val="center"/>
           </w:tcPr>
           <w:p>
@@ -1452,7 +1469,7 @@
         </w:tc>
         <w:tc>
           <w:tcPr>
-            <w:tcW w:type="dxa" w:w="3411"/>
+            <w:tcW w:type="dxa" w:w="2961"/>
             <w:vAlign w:val="center"/>
           </w:tcPr>
           <w:p>
@@ -1475,7 +1492,7 @@
         </w:trPr>
         <w:tc>
           <w:tcPr>
-            <w:tcW w:type="dxa" w:w="1792"/>
+            <w:tcW w:type="dxa" w:w="1921"/>
             <w:vAlign w:val="center"/>
           </w:tcPr>
           <w:p>
@@ -1493,7 +1510,7 @@
         </w:tc>
         <w:tc>
           <w:tcPr>
-            <w:tcW w:type="dxa" w:w="4434"/>
+            <w:tcW w:type="dxa" w:w="4755"/>
             <w:vAlign w:val="center"/>
           </w:tcPr>
           <w:p>
@@ -1511,7 +1528,7 @@
         </w:tc>
         <w:tc>
           <w:tcPr>
-            <w:tcW w:type="dxa" w:w="3411"/>
+            <w:tcW w:type="dxa" w:w="2961"/>
             <w:vAlign w:val="center"/>
           </w:tcPr>
           <w:p>
@@ -1534,7 +1551,7 @@
         </w:trPr>
         <w:tc>
           <w:tcPr>
-            <w:tcW w:type="dxa" w:w="1792"/>
+            <w:tcW w:type="dxa" w:w="1921"/>
             <w:vAlign w:val="center"/>
           </w:tcPr>
           <w:p>
@@ -1552,7 +1569,7 @@
         </w:tc>
         <w:tc>
           <w:tcPr>
-            <w:tcW w:type="dxa" w:w="4434"/>
+            <w:tcW w:type="dxa" w:w="4755"/>
             <w:vAlign w:val="center"/>
           </w:tcPr>
           <w:p>
@@ -1570,7 +1587,7 @@
         </w:tc>
         <w:tc>
           <w:tcPr>
-            <w:tcW w:type="dxa" w:w="3411"/>
+            <w:tcW w:type="dxa" w:w="2961"/>
             <w:vAlign w:val="center"/>
           </w:tcPr>
           <w:p>
@@ -1593,7 +1610,7 @@
         </w:trPr>
         <w:tc>
           <w:tcPr>
-            <w:tcW w:type="dxa" w:w="1792"/>
+            <w:tcW w:type="dxa" w:w="1921"/>
             <w:vAlign w:val="center"/>
           </w:tcPr>
           <w:p>
@@ -1611,7 +1628,7 @@
         </w:tc>
         <w:tc>
           <w:tcPr>
-            <w:tcW w:type="dxa" w:w="4434"/>
+            <w:tcW w:type="dxa" w:w="4755"/>
             <w:vAlign w:val="center"/>
           </w:tcPr>
           <w:p>
@@ -1629,7 +1646,7 @@
         </w:tc>
         <w:tc>
           <w:tcPr>
-            <w:tcW w:type="dxa" w:w="3411"/>
+            <w:tcW w:type="dxa" w:w="2961"/>
             <w:vAlign w:val="center"/>
           </w:tcPr>
           <w:p>
@@ -1652,7 +1669,7 @@
         </w:trPr>
         <w:tc>
           <w:tcPr>
-            <w:tcW w:type="dxa" w:w="1792"/>
+            <w:tcW w:type="dxa" w:w="1921"/>
             <w:vAlign w:val="center"/>
           </w:tcPr>
           <w:p>
@@ -1670,7 +1687,7 @@
         </w:tc>
         <w:tc>
           <w:tcPr>
-            <w:tcW w:type="dxa" w:w="4434"/>
+            <w:tcW w:type="dxa" w:w="4755"/>
             <w:vAlign w:val="center"/>
           </w:tcPr>
           <w:p>
@@ -1688,7 +1705,7 @@
         </w:tc>
         <w:tc>
           <w:tcPr>
-            <w:tcW w:type="dxa" w:w="3411"/>
+            <w:tcW w:type="dxa" w:w="2961"/>
             <w:vAlign w:val="center"/>
           </w:tcPr>
           <w:p>
@@ -1711,7 +1728,7 @@
         </w:trPr>
         <w:tc>
           <w:tcPr>
-            <w:tcW w:type="dxa" w:w="1792"/>
+            <w:tcW w:type="dxa" w:w="1921"/>
             <w:vAlign w:val="center"/>
           </w:tcPr>
           <w:p>
@@ -1729,7 +1746,7 @@
         </w:tc>
         <w:tc>
           <w:tcPr>
-            <w:tcW w:type="dxa" w:w="4434"/>
+            <w:tcW w:type="dxa" w:w="4755"/>
             <w:vAlign w:val="center"/>
           </w:tcPr>
           <w:p>
@@ -1747,7 +1764,7 @@
         </w:tc>
         <w:tc>
           <w:tcPr>
-            <w:tcW w:type="dxa" w:w="3411"/>
+            <w:tcW w:type="dxa" w:w="2961"/>
             <w:vAlign w:val="center"/>
           </w:tcPr>
           <w:p>
@@ -1770,7 +1787,7 @@
         </w:trPr>
         <w:tc>
           <w:tcPr>
-            <w:tcW w:type="dxa" w:w="1792"/>
+            <w:tcW w:type="dxa" w:w="1921"/>
             <w:vAlign w:val="center"/>
           </w:tcPr>
           <w:p>
@@ -1788,7 +1805,7 @@
         </w:tc>
         <w:tc>
           <w:tcPr>
-            <w:tcW w:type="dxa" w:w="4434"/>
+            <w:tcW w:type="dxa" w:w="4755"/>
             <w:vAlign w:val="center"/>
           </w:tcPr>
           <w:p>
@@ -1806,7 +1823,7 @@
         </w:tc>
         <w:tc>
           <w:tcPr>
-            <w:tcW w:type="dxa" w:w="3411"/>
+            <w:tcW w:type="dxa" w:w="2961"/>
             <w:vAlign w:val="center"/>
           </w:tcPr>
           <w:p>
@@ -1829,7 +1846,7 @@
         </w:trPr>
         <w:tc>
           <w:tcPr>
-            <w:tcW w:type="dxa" w:w="1792"/>
+            <w:tcW w:type="dxa" w:w="1921"/>
             <w:vAlign w:val="center"/>
           </w:tcPr>
           <w:p>
@@ -1847,7 +1864,7 @@
         </w:tc>
         <w:tc>
           <w:tcPr>
-            <w:tcW w:type="dxa" w:w="4434"/>
+            <w:tcW w:type="dxa" w:w="4755"/>
             <w:vAlign w:val="center"/>
           </w:tcPr>
           <w:p>
@@ -1865,7 +1882,7 @@
         </w:tc>
         <w:tc>
           <w:tcPr>
-            <w:tcW w:type="dxa" w:w="3411"/>
+            <w:tcW w:type="dxa" w:w="2961"/>
             <w:vAlign w:val="center"/>
           </w:tcPr>
           <w:p>
@@ -1888,7 +1905,7 @@
         </w:trPr>
         <w:tc>
           <w:tcPr>
-            <w:tcW w:type="dxa" w:w="1792"/>
+            <w:tcW w:type="dxa" w:w="1921"/>
             <w:vAlign w:val="center"/>
           </w:tcPr>
           <w:p>
@@ -1906,7 +1923,7 @@
         </w:tc>
         <w:tc>
           <w:tcPr>
-            <w:tcW w:type="dxa" w:w="4434"/>
+            <w:tcW w:type="dxa" w:w="4755"/>
             <w:vAlign w:val="center"/>
           </w:tcPr>
           <w:p>
@@ -1924,7 +1941,7 @@
         </w:tc>
         <w:tc>
           <w:tcPr>
-            <w:tcW w:type="dxa" w:w="3411"/>
+            <w:tcW w:type="dxa" w:w="2961"/>
             <w:vAlign w:val="center"/>
           </w:tcPr>
           <w:p>
@@ -1947,7 +1964,7 @@
         </w:trPr>
         <w:tc>
           <w:tcPr>
-            <w:tcW w:type="dxa" w:w="1792"/>
+            <w:tcW w:type="dxa" w:w="1921"/>
             <w:vAlign w:val="center"/>
           </w:tcPr>
           <w:p>
@@ -1965,7 +1982,7 @@
         </w:tc>
         <w:tc>
           <w:tcPr>
-            <w:tcW w:type="dxa" w:w="4434"/>
+            <w:tcW w:type="dxa" w:w="4755"/>
             <w:vAlign w:val="center"/>
           </w:tcPr>
           <w:p>
@@ -1983,7 +2000,7 @@
         </w:tc>
         <w:tc>
           <w:tcPr>
-            <w:tcW w:type="dxa" w:w="3411"/>
+            <w:tcW w:type="dxa" w:w="2961"/>
             <w:vAlign w:val="center"/>
           </w:tcPr>
           <w:p>
@@ -2006,7 +2023,7 @@
         </w:trPr>
         <w:tc>
           <w:tcPr>
-            <w:tcW w:type="dxa" w:w="1792"/>
+            <w:tcW w:type="dxa" w:w="1921"/>
             <w:vAlign w:val="center"/>
           </w:tcPr>
           <w:p>
@@ -2024,7 +2041,7 @@
         </w:tc>
         <w:tc>
           <w:tcPr>
-            <w:tcW w:type="dxa" w:w="4434"/>
+            <w:tcW w:type="dxa" w:w="4755"/>
             <w:vAlign w:val="center"/>
           </w:tcPr>
           <w:p>
@@ -2042,7 +2059,7 @@
         </w:tc>
         <w:tc>
           <w:tcPr>
-            <w:tcW w:type="dxa" w:w="3411"/>
+            <w:tcW w:type="dxa" w:w="2961"/>
             <w:vAlign w:val="center"/>
           </w:tcPr>
           <w:p>
@@ -2065,7 +2082,7 @@
         </w:trPr>
         <w:tc>
           <w:tcPr>
-            <w:tcW w:type="dxa" w:w="1792"/>
+            <w:tcW w:type="dxa" w:w="1921"/>
             <w:vAlign w:val="center"/>
           </w:tcPr>
           <w:p>
@@ -2083,7 +2100,7 @@
         </w:tc>
         <w:tc>
           <w:tcPr>
-            <w:tcW w:type="dxa" w:w="4434"/>
+            <w:tcW w:type="dxa" w:w="4755"/>
             <w:vAlign w:val="center"/>
           </w:tcPr>
           <w:p>
@@ -2101,7 +2118,7 @@
         </w:tc>
         <w:tc>
           <w:tcPr>
-            <w:tcW w:type="dxa" w:w="3411"/>
+            <w:tcW w:type="dxa" w:w="2961"/>
             <w:vAlign w:val="center"/>
           </w:tcPr>
           <w:p>
@@ -2124,7 +2141,7 @@
         </w:trPr>
         <w:tc>
           <w:tcPr>
-            <w:tcW w:type="dxa" w:w="1792"/>
+            <w:tcW w:type="dxa" w:w="1921"/>
             <w:vAlign w:val="center"/>
           </w:tcPr>
           <w:p>
@@ -2142,7 +2159,7 @@
         </w:tc>
         <w:tc>
           <w:tcPr>
-            <w:tcW w:type="dxa" w:w="4434"/>
+            <w:tcW w:type="dxa" w:w="4755"/>
             <w:vAlign w:val="center"/>
           </w:tcPr>
           <w:p>
@@ -2160,7 +2177,7 @@
         </w:tc>
         <w:tc>
           <w:tcPr>
-            <w:tcW w:type="dxa" w:w="3411"/>
+            <w:tcW w:type="dxa" w:w="2961"/>
             <w:vAlign w:val="center"/>
           </w:tcPr>
           <w:p>
@@ -2183,7 +2200,7 @@
         </w:trPr>
         <w:tc>
           <w:tcPr>
-            <w:tcW w:type="dxa" w:w="1792"/>
+            <w:tcW w:type="dxa" w:w="1921"/>
             <w:vAlign w:val="center"/>
           </w:tcPr>
           <w:p>
@@ -2201,7 +2218,7 @@
         </w:tc>
         <w:tc>
           <w:tcPr>
-            <w:tcW w:type="dxa" w:w="4434"/>
+            <w:tcW w:type="dxa" w:w="4755"/>
             <w:vAlign w:val="center"/>
           </w:tcPr>
           <w:p>
@@ -2219,7 +2236,7 @@
         </w:tc>
         <w:tc>
           <w:tcPr>
-            <w:tcW w:type="dxa" w:w="3411"/>
+            <w:tcW w:type="dxa" w:w="2961"/>
             <w:vAlign w:val="center"/>
           </w:tcPr>
           <w:p>
@@ -2242,7 +2259,7 @@
         </w:trPr>
         <w:tc>
           <w:tcPr>
-            <w:tcW w:type="dxa" w:w="1792"/>
+            <w:tcW w:type="dxa" w:w="1921"/>
             <w:vAlign w:val="center"/>
           </w:tcPr>
           <w:p>
@@ -2260,7 +2277,7 @@
         </w:tc>
         <w:tc>
           <w:tcPr>
-            <w:tcW w:type="dxa" w:w="4434"/>
+            <w:tcW w:type="dxa" w:w="4755"/>
             <w:vAlign w:val="center"/>
           </w:tcPr>
           <w:p>
@@ -2278,7 +2295,7 @@
         </w:tc>
         <w:tc>
           <w:tcPr>
-            <w:tcW w:type="dxa" w:w="3411"/>
+            <w:tcW w:type="dxa" w:w="2961"/>
             <w:vAlign w:val="center"/>
           </w:tcPr>
           <w:p>
@@ -2301,7 +2318,7 @@
         </w:trPr>
         <w:tc>
           <w:tcPr>
-            <w:tcW w:type="dxa" w:w="1792"/>
+            <w:tcW w:type="dxa" w:w="1921"/>
             <w:vAlign w:val="center"/>
           </w:tcPr>
           <w:p>
@@ -2319,7 +2336,7 @@
         </w:tc>
         <w:tc>
           <w:tcPr>
-            <w:tcW w:type="dxa" w:w="4434"/>
+            <w:tcW w:type="dxa" w:w="4755"/>
             <w:vAlign w:val="center"/>
           </w:tcPr>
           <w:p>
@@ -2337,7 +2354,7 @@
         </w:tc>
         <w:tc>
           <w:tcPr>
-            <w:tcW w:type="dxa" w:w="3411"/>
+            <w:tcW w:type="dxa" w:w="2961"/>
             <w:vAlign w:val="center"/>
           </w:tcPr>
           <w:p>
@@ -2360,7 +2377,7 @@
         </w:trPr>
         <w:tc>
           <w:tcPr>
-            <w:tcW w:type="dxa" w:w="1792"/>
+            <w:tcW w:type="dxa" w:w="1921"/>
             <w:vAlign w:val="center"/>
           </w:tcPr>
           <w:p>
@@ -2378,7 +2395,7 @@
         </w:tc>
         <w:tc>
           <w:tcPr>
-            <w:tcW w:type="dxa" w:w="4434"/>
+            <w:tcW w:type="dxa" w:w="4755"/>
             <w:vAlign w:val="center"/>
           </w:tcPr>
           <w:p>
@@ -2396,7 +2413,7 @@
         </w:tc>
         <w:tc>
           <w:tcPr>
-            <w:tcW w:type="dxa" w:w="3411"/>
+            <w:tcW w:type="dxa" w:w="2961"/>
             <w:vAlign w:val="center"/>
           </w:tcPr>
           <w:p>
@@ -2419,7 +2436,7 @@
         </w:trPr>
         <w:tc>
           <w:tcPr>
-            <w:tcW w:type="dxa" w:w="1792"/>
+            <w:tcW w:type="dxa" w:w="1921"/>
             <w:vAlign w:val="center"/>
           </w:tcPr>
           <w:p>
@@ -2437,7 +2454,7 @@
         </w:tc>
         <w:tc>
           <w:tcPr>
-            <w:tcW w:type="dxa" w:w="4434"/>
+            <w:tcW w:type="dxa" w:w="4755"/>
             <w:vAlign w:val="center"/>
           </w:tcPr>
           <w:p>
@@ -2455,7 +2472,7 @@
         </w:tc>
         <w:tc>
           <w:tcPr>
-            <w:tcW w:type="dxa" w:w="3411"/>
+            <w:tcW w:type="dxa" w:w="2961"/>
             <w:vAlign w:val="center"/>
           </w:tcPr>
           <w:p>
@@ -2478,7 +2495,7 @@
         </w:trPr>
         <w:tc>
           <w:tcPr>
-            <w:tcW w:type="dxa" w:w="1792"/>
+            <w:tcW w:type="dxa" w:w="1921"/>
             <w:vAlign w:val="center"/>
           </w:tcPr>
           <w:p>
@@ -2496,7 +2513,7 @@
         </w:tc>
         <w:tc>
           <w:tcPr>
-            <w:tcW w:type="dxa" w:w="4434"/>
+            <w:tcW w:type="dxa" w:w="4755"/>
             <w:vAlign w:val="center"/>
           </w:tcPr>
           <w:p>
@@ -2514,19 +2531,19 @@
         </w:tc>
         <w:tc>
           <w:tcPr>
-            <w:tcW w:type="dxa" w:w="3411"/>
-            <w:vAlign w:val="center"/>
-          </w:tcPr>
-          <w:p>
-            <w:pPr>
-              <w:spacing w:before="79" w:after="79" w:line="276" w:lineRule="auto"/>
-            </w:pPr>
-            <w:r>
-              <w:rPr>
-                <w:rFonts w:ascii="Calibri" w:hAnsi="Calibri"/>
-                <w:sz w:val="20"/>
-              </w:rPr>
-              <w:t>m²HE par kg CO2 éq. et par an</w:t>
+            <w:tcW w:type="dxa" w:w="2961"/>
+            <w:vAlign w:val="center"/>
+          </w:tcPr>
+          <w:p>
+            <w:pPr>
+              <w:spacing w:before="79" w:after="79" w:line="276" w:lineRule="auto"/>
+            </w:pPr>
+            <w:r>
+              <w:rPr>
+                <w:rFonts w:ascii="Calibri" w:hAnsi="Calibri"/>
+                <w:sz w:val="20"/>
+              </w:rPr>
+              <w:t>m²HE par kg CO2 éq.</w:t>
             </w:r>
           </w:p>
         </w:tc>
@@ -2537,7 +2554,7 @@
         </w:trPr>
         <w:tc>
           <w:tcPr>
-            <w:tcW w:type="dxa" w:w="1792"/>
+            <w:tcW w:type="dxa" w:w="1921"/>
             <w:vAlign w:val="center"/>
           </w:tcPr>
           <w:p>
@@ -2555,7 +2572,7 @@
         </w:tc>
         <w:tc>
           <w:tcPr>
-            <w:tcW w:type="dxa" w:w="4434"/>
+            <w:tcW w:type="dxa" w:w="4755"/>
             <w:vAlign w:val="center"/>
           </w:tcPr>
           <w:p>
@@ -2573,7 +2590,7 @@
         </w:tc>
         <w:tc>
           <w:tcPr>
-            <w:tcW w:type="dxa" w:w="3411"/>
+            <w:tcW w:type="dxa" w:w="2961"/>
             <w:vAlign w:val="center"/>
           </w:tcPr>
           <w:p>
@@ -3757,6 +3774,7 @@
     </w:p>
     <w:p>
       <w:pPr>
+        <w:keepNext/>
         <w:spacing w:before="57" w:after="227" w:line="288" w:lineRule="auto"/>
       </w:pPr>
       <w:r>
@@ -5056,6 +5074,7 @@
     </w:tbl>
     <w:p>
       <w:pPr>
+        <w:keepNext/>
         <w:spacing w:before="57" w:after="227" w:line="288" w:lineRule="auto"/>
       </w:pPr>
       <w:r>
@@ -5100,6 +5119,7 @@
           </w:tcPr>
           <w:p>
             <w:pPr>
+              <w:keepNext/>
               <w:spacing w:before="79" w:after="79" w:line="276" w:lineRule="auto"/>
             </w:pPr>
             <w:r>
@@ -5121,6 +5141,7 @@
           </w:tcPr>
           <w:p>
             <w:pPr>
+              <w:keepNext/>
               <w:spacing w:before="79" w:after="79" w:line="276" w:lineRule="auto"/>
             </w:pPr>
             <w:r>
@@ -5142,6 +5163,7 @@
           </w:tcPr>
           <w:p>
             <w:pPr>
+              <w:keepNext/>
               <w:spacing w:before="79" w:after="79" w:line="276" w:lineRule="auto"/>
             </w:pPr>
             <w:r>
@@ -5167,6 +5189,7 @@
           </w:tcPr>
           <w:p>
             <w:pPr>
+              <w:keepNext/>
               <w:spacing w:before="79" w:after="79" w:line="276" w:lineRule="auto"/>
             </w:pPr>
             <w:r>
@@ -5185,6 +5208,7 @@
           </w:tcPr>
           <w:p>
             <w:pPr>
+              <w:keepNext/>
               <w:spacing w:before="79" w:after="79" w:line="276" w:lineRule="auto"/>
             </w:pPr>
             <w:r>
@@ -5203,6 +5227,7 @@
           </w:tcPr>
           <w:p>
             <w:pPr>
+              <w:keepNext/>
               <w:spacing w:before="79" w:after="79" w:line="276" w:lineRule="auto"/>
             </w:pPr>
             <w:r>
@@ -5226,6 +5251,7 @@
           </w:tcPr>
           <w:p>
             <w:pPr>
+              <w:keepNext/>
               <w:spacing w:before="79" w:after="79" w:line="276" w:lineRule="auto"/>
             </w:pPr>
             <w:r>
@@ -5244,6 +5270,7 @@
           </w:tcPr>
           <w:p>
             <w:pPr>
+              <w:keepNext/>
               <w:spacing w:before="79" w:after="79" w:line="276" w:lineRule="auto"/>
             </w:pPr>
             <w:r>
@@ -5262,6 +5289,7 @@
           </w:tcPr>
           <w:p>
             <w:pPr>
+              <w:keepNext/>
               <w:spacing w:before="79" w:after="79" w:line="276" w:lineRule="auto"/>
             </w:pPr>
             <w:r>
@@ -5285,6 +5313,7 @@
           </w:tcPr>
           <w:p>
             <w:pPr>
+              <w:keepNext/>
               <w:spacing w:before="79" w:after="79" w:line="276" w:lineRule="auto"/>
             </w:pPr>
             <w:r>
@@ -5303,6 +5332,7 @@
           </w:tcPr>
           <w:p>
             <w:pPr>
+              <w:keepNext/>
               <w:spacing w:before="79" w:after="79" w:line="276" w:lineRule="auto"/>
             </w:pPr>
             <w:r>
@@ -5321,6 +5351,7 @@
           </w:tcPr>
           <w:p>
             <w:pPr>
+              <w:keepNext/>
               <w:spacing w:before="79" w:after="79" w:line="276" w:lineRule="auto"/>
             </w:pPr>
             <w:r>
@@ -5344,6 +5375,7 @@
           </w:tcPr>
           <w:p>
             <w:pPr>
+              <w:keepNext/>
               <w:spacing w:before="79" w:after="79" w:line="276" w:lineRule="auto"/>
             </w:pPr>
             <w:r>
@@ -5362,6 +5394,7 @@
           </w:tcPr>
           <w:p>
             <w:pPr>
+              <w:keepNext/>
               <w:spacing w:before="79" w:after="79" w:line="276" w:lineRule="auto"/>
             </w:pPr>
             <w:r>
@@ -5380,6 +5413,7 @@
           </w:tcPr>
           <w:p>
             <w:pPr>
+              <w:keepNext/>
               <w:spacing w:before="79" w:after="79" w:line="276" w:lineRule="auto"/>
             </w:pPr>
             <w:r>
@@ -5403,6 +5437,7 @@
           </w:tcPr>
           <w:p>
             <w:pPr>
+              <w:keepNext/>
               <w:spacing w:before="79" w:after="79" w:line="276" w:lineRule="auto"/>
             </w:pPr>
             <w:r>
@@ -5421,6 +5456,7 @@
           </w:tcPr>
           <w:p>
             <w:pPr>
+              <w:keepNext/>
               <w:spacing w:before="79" w:after="79" w:line="276" w:lineRule="auto"/>
             </w:pPr>
             <w:r>
@@ -5439,6 +5475,7 @@
           </w:tcPr>
           <w:p>
             <w:pPr>
+              <w:keepNext/>
               <w:spacing w:before="79" w:after="79" w:line="276" w:lineRule="auto"/>
             </w:pPr>
             <w:r>
@@ -6387,6 +6424,7 @@
           </w:tcPr>
           <w:p>
             <w:pPr>
+              <w:keepNext/>
               <w:spacing w:before="79" w:after="79" w:line="276" w:lineRule="auto"/>
             </w:pPr>
             <w:r>
@@ -6408,6 +6446,7 @@
           </w:tcPr>
           <w:p>
             <w:pPr>
+              <w:keepNext/>
               <w:spacing w:before="79" w:after="79" w:line="276" w:lineRule="auto"/>
             </w:pPr>
             <w:r>
@@ -6429,6 +6468,7 @@
           </w:tcPr>
           <w:p>
             <w:pPr>
+              <w:keepNext/>
               <w:spacing w:before="79" w:after="79" w:line="276" w:lineRule="auto"/>
             </w:pPr>
             <w:r>
@@ -6454,6 +6494,7 @@
           </w:tcPr>
           <w:p>
             <w:pPr>
+              <w:keepNext/>
               <w:spacing w:before="79" w:after="79" w:line="276" w:lineRule="auto"/>
             </w:pPr>
             <w:r>
@@ -6472,6 +6513,7 @@
           </w:tcPr>
           <w:p>
             <w:pPr>
+              <w:keepNext/>
               <w:spacing w:before="79" w:after="79" w:line="276" w:lineRule="auto"/>
             </w:pPr>
             <w:r>
@@ -6490,6 +6532,7 @@
           </w:tcPr>
           <w:p>
             <w:pPr>
+              <w:keepNext/>
               <w:spacing w:before="79" w:after="79" w:line="276" w:lineRule="auto"/>
             </w:pPr>
             <w:r>
@@ -6513,6 +6556,7 @@
           </w:tcPr>
           <w:p>
             <w:pPr>
+              <w:keepNext/>
               <w:spacing w:before="79" w:after="79" w:line="276" w:lineRule="auto"/>
             </w:pPr>
             <w:r>
@@ -6531,6 +6575,7 @@
           </w:tcPr>
           <w:p>
             <w:pPr>
+              <w:keepNext/>
               <w:spacing w:before="79" w:after="79" w:line="276" w:lineRule="auto"/>
             </w:pPr>
             <w:r>
@@ -6549,6 +6594,7 @@
           </w:tcPr>
           <w:p>
             <w:pPr>
+              <w:keepNext/>
               <w:spacing w:before="79" w:after="79" w:line="276" w:lineRule="auto"/>
             </w:pPr>
             <w:r>
@@ -6572,6 +6618,7 @@
           </w:tcPr>
           <w:p>
             <w:pPr>
+              <w:keepNext/>
               <w:spacing w:before="79" w:after="79" w:line="276" w:lineRule="auto"/>
             </w:pPr>
             <w:r>
@@ -6590,6 +6637,7 @@
           </w:tcPr>
           <w:p>
             <w:pPr>
+              <w:keepNext/>
               <w:spacing w:before="79" w:after="79" w:line="276" w:lineRule="auto"/>
             </w:pPr>
             <w:r>
@@ -6608,6 +6656,7 @@
           </w:tcPr>
           <w:p>
             <w:pPr>
+              <w:keepNext/>
               <w:spacing w:before="79" w:after="79" w:line="276" w:lineRule="auto"/>
             </w:pPr>
             <w:r>
@@ -6763,6 +6812,7 @@
     </w:p>
     <w:p>
       <w:pPr>
+        <w:keepNext/>
         <w:spacing w:before="57" w:after="227" w:line="288" w:lineRule="auto"/>
       </w:pPr>
       <w:r>
@@ -8378,6 +8428,7 @@
     </w:p>
     <w:p>
       <w:pPr>
+        <w:keepNext/>
         <w:spacing w:before="57" w:after="227" w:line="288" w:lineRule="auto"/>
       </w:pPr>
       <w:r>
@@ -8845,6 +8896,7 @@
     </w:p>
     <w:p>
       <w:pPr>
+        <w:keepNext/>
         <w:spacing w:before="57" w:after="227" w:line="288" w:lineRule="auto"/>
       </w:pPr>
       <w:r>
@@ -8969,6 +9021,7 @@
     </w:p>
     <w:p>
       <w:pPr>
+        <w:keepNext/>
         <w:spacing w:before="57" w:after="227" w:line="288" w:lineRule="auto"/>
       </w:pPr>
       <w:r>
@@ -9518,7 +9571,7 @@
           <w:rFonts w:ascii="Calibri" w:hAnsi="Calibri"/>
           <w:sz w:val="20"/>
         </w:rPr>
-        <w:t>(G3) CF = S_terres x (1 - p_cult) x (pente / 2) x TCRE = 1,807 x 10^-3 m²HE par kg CO2 éq. et par an (convention C-G2).</w:t>
+        <w:t>(G3) CF = S_terres x (1 - p_cult) x (pente / 2) x TCRE = 1,807 x 10^-3 m²HE par kg CO2 éq., perdus chaque année tant que le réchauffement persiste (convention C-G2).</w:t>
       </w:r>
     </w:p>
     <w:p>
@@ -9785,6 +9838,7 @@
     </w:p>
     <w:p>
       <w:pPr>
+        <w:keepNext/>
         <w:spacing w:before="57" w:after="227" w:line="288" w:lineRule="auto"/>
       </w:pPr>
       <w:r>
@@ -9829,6 +9883,7 @@
           </w:tcPr>
           <w:p>
             <w:pPr>
+              <w:keepNext/>
               <w:spacing w:before="79" w:after="79" w:line="276" w:lineRule="auto"/>
             </w:pPr>
             <w:r>
@@ -9850,6 +9905,7 @@
           </w:tcPr>
           <w:p>
             <w:pPr>
+              <w:keepNext/>
               <w:spacing w:before="79" w:after="79" w:line="276" w:lineRule="auto"/>
             </w:pPr>
             <w:r>
@@ -9871,6 +9927,7 @@
           </w:tcPr>
           <w:p>
             <w:pPr>
+              <w:keepNext/>
               <w:spacing w:before="79" w:after="79" w:line="276" w:lineRule="auto"/>
               <w:jc w:val="center"/>
             </w:pPr>
@@ -9897,6 +9954,7 @@
           </w:tcPr>
           <w:p>
             <w:pPr>
+              <w:keepNext/>
               <w:spacing w:before="79" w:after="79" w:line="276" w:lineRule="auto"/>
             </w:pPr>
             <w:r>
@@ -9915,6 +9973,7 @@
           </w:tcPr>
           <w:p>
             <w:pPr>
+              <w:keepNext/>
               <w:spacing w:before="79" w:after="79" w:line="276" w:lineRule="auto"/>
             </w:pPr>
             <w:r>
@@ -9933,6 +9992,7 @@
           </w:tcPr>
           <w:p>
             <w:pPr>
+              <w:keepNext/>
               <w:spacing w:before="79" w:after="79" w:line="276" w:lineRule="auto"/>
               <w:jc w:val="center"/>
             </w:pPr>
@@ -9957,6 +10017,7 @@
           </w:tcPr>
           <w:p>
             <w:pPr>
+              <w:keepNext/>
               <w:spacing w:before="79" w:after="79" w:line="276" w:lineRule="auto"/>
             </w:pPr>
             <w:r>
@@ -9975,6 +10036,7 @@
           </w:tcPr>
           <w:p>
             <w:pPr>
+              <w:keepNext/>
               <w:spacing w:before="79" w:after="79" w:line="276" w:lineRule="auto"/>
             </w:pPr>
             <w:r>
@@ -9993,6 +10055,7 @@
           </w:tcPr>
           <w:p>
             <w:pPr>
+              <w:keepNext/>
               <w:spacing w:before="79" w:after="79" w:line="276" w:lineRule="auto"/>
               <w:jc w:val="center"/>
             </w:pPr>
@@ -10017,6 +10080,7 @@
           </w:tcPr>
           <w:p>
             <w:pPr>
+              <w:keepNext/>
               <w:spacing w:before="79" w:after="79" w:line="276" w:lineRule="auto"/>
             </w:pPr>
             <w:r>
@@ -10035,6 +10099,7 @@
           </w:tcPr>
           <w:p>
             <w:pPr>
+              <w:keepNext/>
               <w:spacing w:before="79" w:after="79" w:line="276" w:lineRule="auto"/>
             </w:pPr>
             <w:r>
@@ -10053,6 +10118,7 @@
           </w:tcPr>
           <w:p>
             <w:pPr>
+              <w:keepNext/>
               <w:spacing w:before="79" w:after="79" w:line="276" w:lineRule="auto"/>
               <w:jc w:val="center"/>
             </w:pPr>
@@ -10077,6 +10143,7 @@
           </w:tcPr>
           <w:p>
             <w:pPr>
+              <w:keepNext/>
               <w:spacing w:before="79" w:after="79" w:line="276" w:lineRule="auto"/>
             </w:pPr>
             <w:r>
@@ -10095,6 +10162,7 @@
           </w:tcPr>
           <w:p>
             <w:pPr>
+              <w:keepNext/>
               <w:spacing w:before="79" w:after="79" w:line="276" w:lineRule="auto"/>
             </w:pPr>
             <w:r>
@@ -10113,6 +10181,7 @@
           </w:tcPr>
           <w:p>
             <w:pPr>
+              <w:keepNext/>
               <w:spacing w:before="79" w:after="79" w:line="276" w:lineRule="auto"/>
               <w:jc w:val="center"/>
             </w:pPr>
@@ -10512,6 +10581,7 @@
     </w:p>
     <w:p>
       <w:pPr>
+        <w:keepNext/>
         <w:spacing w:before="57" w:after="227" w:line="288" w:lineRule="auto"/>
       </w:pPr>
       <w:r>
@@ -12210,6 +12280,7 @@
           </w:tcPr>
           <w:p>
             <w:pPr>
+              <w:keepNext/>
               <w:spacing w:before="79" w:after="79" w:line="276" w:lineRule="auto"/>
             </w:pPr>
             <w:r>
@@ -12231,6 +12302,7 @@
           </w:tcPr>
           <w:p>
             <w:pPr>
+              <w:keepNext/>
               <w:spacing w:before="79" w:after="79" w:line="276" w:lineRule="auto"/>
             </w:pPr>
             <w:r>
@@ -12252,6 +12324,7 @@
           </w:tcPr>
           <w:p>
             <w:pPr>
+              <w:keepNext/>
               <w:spacing w:before="79" w:after="79" w:line="276" w:lineRule="auto"/>
               <w:jc w:val="center"/>
             </w:pPr>
@@ -12274,6 +12347,7 @@
           </w:tcPr>
           <w:p>
             <w:pPr>
+              <w:keepNext/>
               <w:spacing w:before="79" w:after="79" w:line="276" w:lineRule="auto"/>
             </w:pPr>
             <w:r>
@@ -12295,6 +12369,7 @@
           </w:tcPr>
           <w:p>
             <w:pPr>
+              <w:keepNext/>
               <w:spacing w:before="79" w:after="79" w:line="276" w:lineRule="auto"/>
             </w:pPr>
             <w:r>
@@ -12316,6 +12391,7 @@
           </w:tcPr>
           <w:p>
             <w:pPr>
+              <w:keepNext/>
               <w:spacing w:before="79" w:after="79" w:line="276" w:lineRule="auto"/>
               <w:jc w:val="center"/>
             </w:pPr>
@@ -12338,6 +12414,7 @@
           </w:tcPr>
           <w:p>
             <w:pPr>
+              <w:keepNext/>
               <w:spacing w:before="79" w:after="79" w:line="276" w:lineRule="auto"/>
               <w:jc w:val="center"/>
             </w:pPr>
@@ -12360,6 +12437,7 @@
           </w:tcPr>
           <w:p>
             <w:pPr>
+              <w:keepNext/>
               <w:spacing w:before="79" w:after="79" w:line="276" w:lineRule="auto"/>
               <w:jc w:val="center"/>
             </w:pPr>
@@ -12386,6 +12464,7 @@
           </w:tcPr>
           <w:p>
             <w:pPr>
+              <w:keepNext/>
               <w:spacing w:before="79" w:after="79" w:line="276" w:lineRule="auto"/>
             </w:pPr>
             <w:r>
@@ -12404,6 +12483,7 @@
           </w:tcPr>
           <w:p>
             <w:pPr>
+              <w:keepNext/>
               <w:spacing w:before="79" w:after="79" w:line="276" w:lineRule="auto"/>
             </w:pPr>
             <w:r>
@@ -12422,6 +12502,7 @@
           </w:tcPr>
           <w:p>
             <w:pPr>
+              <w:keepNext/>
               <w:spacing w:before="79" w:after="79" w:line="276" w:lineRule="auto"/>
               <w:jc w:val="center"/>
             </w:pPr>
@@ -12441,6 +12522,7 @@
           </w:tcPr>
           <w:p>
             <w:pPr>
+              <w:keepNext/>
               <w:spacing w:before="79" w:after="79" w:line="276" w:lineRule="auto"/>
             </w:pPr>
             <w:r>
@@ -12459,6 +12541,7 @@
           </w:tcPr>
           <w:p>
             <w:pPr>
+              <w:keepNext/>
               <w:spacing w:before="79" w:after="79" w:line="276" w:lineRule="auto"/>
             </w:pPr>
             <w:r>
@@ -12477,6 +12560,7 @@
           </w:tcPr>
           <w:p>
             <w:pPr>
+              <w:keepNext/>
               <w:spacing w:before="79" w:after="79" w:line="276" w:lineRule="auto"/>
             </w:pPr>
             <w:r>
@@ -12495,6 +12579,7 @@
           </w:tcPr>
           <w:p>
             <w:pPr>
+              <w:keepNext/>
               <w:spacing w:before="79" w:after="79" w:line="276" w:lineRule="auto"/>
               <w:jc w:val="center"/>
             </w:pPr>
@@ -12514,6 +12599,7 @@
           </w:tcPr>
           <w:p>
             <w:pPr>
+              <w:keepNext/>
               <w:spacing w:before="79" w:after="79" w:line="276" w:lineRule="auto"/>
             </w:pPr>
             <w:r>
@@ -12537,6 +12623,7 @@
           </w:tcPr>
           <w:p>
             <w:pPr>
+              <w:keepNext/>
               <w:spacing w:before="79" w:after="79" w:line="276" w:lineRule="auto"/>
             </w:pPr>
             <w:r>
@@ -12555,6 +12642,7 @@
           </w:tcPr>
           <w:p>
             <w:pPr>
+              <w:keepNext/>
               <w:spacing w:before="79" w:after="79" w:line="276" w:lineRule="auto"/>
             </w:pPr>
             <w:r>
@@ -12573,6 +12661,7 @@
           </w:tcPr>
           <w:p>
             <w:pPr>
+              <w:keepNext/>
               <w:spacing w:before="79" w:after="79" w:line="276" w:lineRule="auto"/>
               <w:jc w:val="center"/>
             </w:pPr>
@@ -12592,6 +12681,7 @@
           </w:tcPr>
           <w:p>
             <w:pPr>
+              <w:keepNext/>
               <w:spacing w:before="79" w:after="79" w:line="276" w:lineRule="auto"/>
               <w:jc w:val="center"/>
             </w:pPr>
@@ -12611,6 +12701,7 @@
           </w:tcPr>
           <w:p>
             <w:pPr>
+              <w:keepNext/>
               <w:spacing w:before="79" w:after="79" w:line="276" w:lineRule="auto"/>
             </w:pPr>
             <w:r>
@@ -12629,6 +12720,7 @@
           </w:tcPr>
           <w:p>
             <w:pPr>
+              <w:keepNext/>
               <w:spacing w:before="79" w:after="79" w:line="276" w:lineRule="auto"/>
             </w:pPr>
           </w:p>
@@ -12640,6 +12732,7 @@
           </w:tcPr>
           <w:p>
             <w:pPr>
+              <w:keepNext/>
               <w:spacing w:before="79" w:after="79" w:line="276" w:lineRule="auto"/>
               <w:jc w:val="center"/>
             </w:pPr>
@@ -12659,6 +12752,7 @@
           </w:tcPr>
           <w:p>
             <w:pPr>
+              <w:keepNext/>
               <w:spacing w:before="79" w:after="79" w:line="276" w:lineRule="auto"/>
               <w:jc w:val="center"/>
             </w:pPr>
@@ -12683,6 +12777,7 @@
           </w:tcPr>
           <w:p>
             <w:pPr>
+              <w:keepNext/>
               <w:spacing w:before="79" w:after="79" w:line="276" w:lineRule="auto"/>
             </w:pPr>
             <w:r>
@@ -12701,6 +12796,7 @@
           </w:tcPr>
           <w:p>
             <w:pPr>
+              <w:keepNext/>
               <w:spacing w:before="79" w:after="79" w:line="276" w:lineRule="auto"/>
             </w:pPr>
             <w:r>
@@ -12719,6 +12815,7 @@
           </w:tcPr>
           <w:p>
             <w:pPr>
+              <w:keepNext/>
               <w:spacing w:before="79" w:after="79" w:line="276" w:lineRule="auto"/>
               <w:jc w:val="center"/>
             </w:pPr>
@@ -12738,6 +12835,7 @@
           </w:tcPr>
           <w:p>
             <w:pPr>
+              <w:keepNext/>
               <w:spacing w:before="79" w:after="79" w:line="276" w:lineRule="auto"/>
             </w:pPr>
             <w:r>
@@ -12756,6 +12854,7 @@
           </w:tcPr>
           <w:p>
             <w:pPr>
+              <w:keepNext/>
               <w:spacing w:before="79" w:after="79" w:line="276" w:lineRule="auto"/>
             </w:pPr>
             <w:r>
@@ -12774,6 +12873,7 @@
           </w:tcPr>
           <w:p>
             <w:pPr>
+              <w:keepNext/>
               <w:spacing w:before="79" w:after="79" w:line="276" w:lineRule="auto"/>
               <w:jc w:val="center"/>
             </w:pPr>
@@ -12793,6 +12893,7 @@
           </w:tcPr>
           <w:p>
             <w:pPr>
+              <w:keepNext/>
               <w:spacing w:before="79" w:after="79" w:line="276" w:lineRule="auto"/>
               <w:jc w:val="center"/>
             </w:pPr>
@@ -12812,6 +12913,7 @@
           </w:tcPr>
           <w:p>
             <w:pPr>
+              <w:keepNext/>
               <w:spacing w:before="79" w:after="79" w:line="276" w:lineRule="auto"/>
               <w:jc w:val="center"/>
             </w:pPr>
@@ -13077,6 +13179,7 @@
           </w:tcPr>
           <w:p>
             <w:pPr>
+              <w:keepNext/>
               <w:spacing w:before="79" w:after="79" w:line="276" w:lineRule="auto"/>
             </w:pPr>
             <w:r>
@@ -13098,6 +13201,7 @@
           </w:tcPr>
           <w:p>
             <w:pPr>
+              <w:keepNext/>
               <w:spacing w:before="79" w:after="79" w:line="276" w:lineRule="auto"/>
             </w:pPr>
             <w:r>
@@ -13119,6 +13223,7 @@
           </w:tcPr>
           <w:p>
             <w:pPr>
+              <w:keepNext/>
               <w:spacing w:before="79" w:after="79" w:line="276" w:lineRule="auto"/>
               <w:jc w:val="center"/>
             </w:pPr>
@@ -13141,6 +13246,7 @@
           </w:tcPr>
           <w:p>
             <w:pPr>
+              <w:keepNext/>
               <w:spacing w:before="79" w:after="79" w:line="276" w:lineRule="auto"/>
             </w:pPr>
             <w:r>
@@ -13162,6 +13268,7 @@
           </w:tcPr>
           <w:p>
             <w:pPr>
+              <w:keepNext/>
               <w:spacing w:before="79" w:after="79" w:line="276" w:lineRule="auto"/>
             </w:pPr>
             <w:r>
@@ -13183,6 +13290,7 @@
           </w:tcPr>
           <w:p>
             <w:pPr>
+              <w:keepNext/>
               <w:spacing w:before="79" w:after="79" w:line="276" w:lineRule="auto"/>
               <w:jc w:val="center"/>
             </w:pPr>
@@ -13209,6 +13317,7 @@
           </w:tcPr>
           <w:p>
             <w:pPr>
+              <w:keepNext/>
               <w:spacing w:before="79" w:after="79" w:line="276" w:lineRule="auto"/>
             </w:pPr>
             <w:r>
@@ -13227,6 +13336,7 @@
           </w:tcPr>
           <w:p>
             <w:pPr>
+              <w:keepNext/>
               <w:spacing w:before="79" w:after="79" w:line="276" w:lineRule="auto"/>
             </w:pPr>
             <w:r>
@@ -13245,6 +13355,7 @@
           </w:tcPr>
           <w:p>
             <w:pPr>
+              <w:keepNext/>
               <w:spacing w:before="79" w:after="79" w:line="276" w:lineRule="auto"/>
               <w:jc w:val="center"/>
             </w:pPr>
@@ -13264,6 +13375,7 @@
           </w:tcPr>
           <w:p>
             <w:pPr>
+              <w:keepNext/>
               <w:spacing w:before="79" w:after="79" w:line="276" w:lineRule="auto"/>
             </w:pPr>
             <w:r>
@@ -13282,6 +13394,7 @@
           </w:tcPr>
           <w:p>
             <w:pPr>
+              <w:keepNext/>
               <w:spacing w:before="79" w:after="79" w:line="276" w:lineRule="auto"/>
               <w:jc w:val="center"/>
             </w:pPr>
@@ -13301,6 +13414,7 @@
           </w:tcPr>
           <w:p>
             <w:pPr>
+              <w:keepNext/>
               <w:spacing w:before="79" w:after="79" w:line="276" w:lineRule="auto"/>
               <w:jc w:val="center"/>
             </w:pPr>
@@ -13325,6 +13439,7 @@
           </w:tcPr>
           <w:p>
             <w:pPr>
+              <w:keepNext/>
               <w:spacing w:before="79" w:after="79" w:line="276" w:lineRule="auto"/>
             </w:pPr>
             <w:r>
@@ -13343,6 +13458,7 @@
           </w:tcPr>
           <w:p>
             <w:pPr>
+              <w:keepNext/>
               <w:spacing w:before="79" w:after="79" w:line="276" w:lineRule="auto"/>
             </w:pPr>
             <w:r>
@@ -13361,6 +13477,7 @@
           </w:tcPr>
           <w:p>
             <w:pPr>
+              <w:keepNext/>
               <w:spacing w:before="79" w:after="79" w:line="276" w:lineRule="auto"/>
               <w:jc w:val="center"/>
             </w:pPr>
@@ -13380,6 +13497,7 @@
           </w:tcPr>
           <w:p>
             <w:pPr>
+              <w:keepNext/>
               <w:spacing w:before="79" w:after="79" w:line="276" w:lineRule="auto"/>
             </w:pPr>
             <w:r>
@@ -13398,6 +13516,7 @@
           </w:tcPr>
           <w:p>
             <w:pPr>
+              <w:keepNext/>
               <w:spacing w:before="79" w:after="79" w:line="276" w:lineRule="auto"/>
               <w:jc w:val="center"/>
             </w:pPr>
@@ -13417,6 +13536,7 @@
           </w:tcPr>
           <w:p>
             <w:pPr>
+              <w:keepNext/>
               <w:spacing w:before="79" w:after="79" w:line="276" w:lineRule="auto"/>
               <w:jc w:val="center"/>
             </w:pPr>
@@ -13441,6 +13561,7 @@
           </w:tcPr>
           <w:p>
             <w:pPr>
+              <w:keepNext/>
               <w:spacing w:before="79" w:after="79" w:line="276" w:lineRule="auto"/>
             </w:pPr>
             <w:r>
@@ -13459,6 +13580,7 @@
           </w:tcPr>
           <w:p>
             <w:pPr>
+              <w:keepNext/>
               <w:spacing w:before="79" w:after="79" w:line="276" w:lineRule="auto"/>
             </w:pPr>
             <w:r>
@@ -13477,6 +13599,7 @@
           </w:tcPr>
           <w:p>
             <w:pPr>
+              <w:keepNext/>
               <w:spacing w:before="79" w:after="79" w:line="276" w:lineRule="auto"/>
               <w:jc w:val="center"/>
             </w:pPr>
@@ -13496,6 +13619,7 @@
           </w:tcPr>
           <w:p>
             <w:pPr>
+              <w:keepNext/>
               <w:spacing w:before="79" w:after="79" w:line="276" w:lineRule="auto"/>
             </w:pPr>
             <w:r>
@@ -13514,6 +13638,7 @@
           </w:tcPr>
           <w:p>
             <w:pPr>
+              <w:keepNext/>
               <w:spacing w:before="79" w:after="79" w:line="276" w:lineRule="auto"/>
             </w:pPr>
             <w:r>
@@ -13532,6 +13657,7 @@
           </w:tcPr>
           <w:p>
             <w:pPr>
+              <w:keepNext/>
               <w:spacing w:before="79" w:after="79" w:line="276" w:lineRule="auto"/>
               <w:jc w:val="center"/>
             </w:pPr>
@@ -13556,6 +13682,7 @@
           </w:tcPr>
           <w:p>
             <w:pPr>
+              <w:keepNext/>
               <w:spacing w:before="79" w:after="79" w:line="276" w:lineRule="auto"/>
             </w:pPr>
             <w:r>
@@ -13574,6 +13701,7 @@
           </w:tcPr>
           <w:p>
             <w:pPr>
+              <w:keepNext/>
               <w:spacing w:before="79" w:after="79" w:line="276" w:lineRule="auto"/>
             </w:pPr>
             <w:r>
@@ -13592,6 +13720,7 @@
           </w:tcPr>
           <w:p>
             <w:pPr>
+              <w:keepNext/>
               <w:spacing w:before="79" w:after="79" w:line="276" w:lineRule="auto"/>
               <w:jc w:val="center"/>
             </w:pPr>
@@ -13611,6 +13740,7 @@
           </w:tcPr>
           <w:p>
             <w:pPr>
+              <w:keepNext/>
               <w:spacing w:before="79" w:after="79" w:line="276" w:lineRule="auto"/>
             </w:pPr>
             <w:r>
@@ -13629,6 +13759,7 @@
           </w:tcPr>
           <w:p>
             <w:pPr>
+              <w:keepNext/>
               <w:spacing w:before="79" w:after="79" w:line="276" w:lineRule="auto"/>
             </w:pPr>
             <w:r>
@@ -13647,6 +13778,7 @@
           </w:tcPr>
           <w:p>
             <w:pPr>
+              <w:keepNext/>
               <w:spacing w:before="79" w:after="79" w:line="276" w:lineRule="auto"/>
               <w:jc w:val="center"/>
             </w:pPr>
@@ -13671,6 +13803,7 @@
           </w:tcPr>
           <w:p>
             <w:pPr>
+              <w:keepNext/>
               <w:spacing w:before="79" w:after="79" w:line="276" w:lineRule="auto"/>
             </w:pPr>
             <w:r>
@@ -13689,6 +13822,7 @@
           </w:tcPr>
           <w:p>
             <w:pPr>
+              <w:keepNext/>
               <w:spacing w:before="79" w:after="79" w:line="276" w:lineRule="auto"/>
             </w:pPr>
             <w:r>
@@ -13707,6 +13841,7 @@
           </w:tcPr>
           <w:p>
             <w:pPr>
+              <w:keepNext/>
               <w:spacing w:before="79" w:after="79" w:line="276" w:lineRule="auto"/>
               <w:jc w:val="center"/>
             </w:pPr>
@@ -13726,6 +13861,7 @@
           </w:tcPr>
           <w:p>
             <w:pPr>
+              <w:keepNext/>
               <w:spacing w:before="79" w:after="79" w:line="276" w:lineRule="auto"/>
             </w:pPr>
             <w:r>
@@ -13744,6 +13880,7 @@
           </w:tcPr>
           <w:p>
             <w:pPr>
+              <w:keepNext/>
               <w:spacing w:before="79" w:after="79" w:line="276" w:lineRule="auto"/>
             </w:pPr>
             <w:r>
@@ -13762,6 +13899,7 @@
           </w:tcPr>
           <w:p>
             <w:pPr>
+              <w:keepNext/>
               <w:spacing w:before="79" w:after="79" w:line="276" w:lineRule="auto"/>
               <w:jc w:val="center"/>
             </w:pPr>
@@ -13786,6 +13924,7 @@
           </w:tcPr>
           <w:p>
             <w:pPr>
+              <w:keepNext/>
               <w:spacing w:before="79" w:after="79" w:line="276" w:lineRule="auto"/>
             </w:pPr>
             <w:r>
@@ -13804,6 +13943,7 @@
           </w:tcPr>
           <w:p>
             <w:pPr>
+              <w:keepNext/>
               <w:spacing w:before="79" w:after="79" w:line="276" w:lineRule="auto"/>
             </w:pPr>
             <w:r>
@@ -13822,6 +13962,7 @@
           </w:tcPr>
           <w:p>
             <w:pPr>
+              <w:keepNext/>
               <w:spacing w:before="79" w:after="79" w:line="276" w:lineRule="auto"/>
               <w:jc w:val="center"/>
             </w:pPr>
@@ -13841,6 +13982,7 @@
           </w:tcPr>
           <w:p>
             <w:pPr>
+              <w:keepNext/>
               <w:spacing w:before="79" w:after="79" w:line="276" w:lineRule="auto"/>
             </w:pPr>
             <w:r>
@@ -13859,6 +14001,7 @@
           </w:tcPr>
           <w:p>
             <w:pPr>
+              <w:keepNext/>
               <w:spacing w:before="79" w:after="79" w:line="276" w:lineRule="auto"/>
             </w:pPr>
             <w:r>
@@ -13877,6 +14020,7 @@
           </w:tcPr>
           <w:p>
             <w:pPr>
+              <w:keepNext/>
               <w:spacing w:before="79" w:after="79" w:line="276" w:lineRule="auto"/>
               <w:jc w:val="center"/>
             </w:pPr>
@@ -13901,6 +14045,7 @@
           </w:tcPr>
           <w:p>
             <w:pPr>
+              <w:keepNext/>
               <w:spacing w:before="79" w:after="79" w:line="276" w:lineRule="auto"/>
             </w:pPr>
             <w:r>
@@ -13919,6 +14064,7 @@
           </w:tcPr>
           <w:p>
             <w:pPr>
+              <w:keepNext/>
               <w:spacing w:before="79" w:after="79" w:line="276" w:lineRule="auto"/>
             </w:pPr>
             <w:r>
@@ -13937,6 +14083,7 @@
           </w:tcPr>
           <w:p>
             <w:pPr>
+              <w:keepNext/>
               <w:spacing w:before="79" w:after="79" w:line="276" w:lineRule="auto"/>
               <w:jc w:val="center"/>
             </w:pPr>
@@ -13956,6 +14103,7 @@
           </w:tcPr>
           <w:p>
             <w:pPr>
+              <w:keepNext/>
               <w:spacing w:before="79" w:after="79" w:line="276" w:lineRule="auto"/>
             </w:pPr>
             <w:r>
@@ -13974,6 +14122,7 @@
           </w:tcPr>
           <w:p>
             <w:pPr>
+              <w:keepNext/>
               <w:spacing w:before="79" w:after="79" w:line="276" w:lineRule="auto"/>
             </w:pPr>
           </w:p>
@@ -13985,6 +14134,7 @@
           </w:tcPr>
           <w:p>
             <w:pPr>
+              <w:keepNext/>
               <w:spacing w:before="79" w:after="79" w:line="276" w:lineRule="auto"/>
             </w:pPr>
           </w:p>
@@ -14108,6 +14258,7 @@
     </w:tbl>
     <w:p>
       <w:pPr>
+        <w:keepNext/>
         <w:spacing w:before="57" w:after="227" w:line="288" w:lineRule="auto"/>
       </w:pPr>
       <w:r>
@@ -14156,6 +14307,7 @@
           </w:tcPr>
           <w:p>
             <w:pPr>
+              <w:keepNext/>
               <w:spacing w:before="79" w:after="79" w:line="276" w:lineRule="auto"/>
             </w:pPr>
             <w:r>
@@ -14177,6 +14329,7 @@
           </w:tcPr>
           <w:p>
             <w:pPr>
+              <w:keepNext/>
               <w:spacing w:before="79" w:after="79" w:line="276" w:lineRule="auto"/>
               <w:jc w:val="center"/>
             </w:pPr>
@@ -14199,6 +14352,7 @@
           </w:tcPr>
           <w:p>
             <w:pPr>
+              <w:keepNext/>
               <w:spacing w:before="79" w:after="79" w:line="276" w:lineRule="auto"/>
               <w:jc w:val="center"/>
             </w:pPr>
@@ -14221,6 +14375,7 @@
           </w:tcPr>
           <w:p>
             <w:pPr>
+              <w:keepNext/>
               <w:spacing w:before="79" w:after="79" w:line="276" w:lineRule="auto"/>
               <w:jc w:val="center"/>
             </w:pPr>
@@ -14243,6 +14398,7 @@
           </w:tcPr>
           <w:p>
             <w:pPr>
+              <w:keepNext/>
               <w:spacing w:before="79" w:after="79" w:line="276" w:lineRule="auto"/>
               <w:jc w:val="center"/>
             </w:pPr>
@@ -14265,6 +14421,7 @@
           </w:tcPr>
           <w:p>
             <w:pPr>
+              <w:keepNext/>
               <w:spacing w:before="79" w:after="79" w:line="276" w:lineRule="auto"/>
               <w:jc w:val="center"/>
             </w:pPr>
@@ -14287,6 +14444,7 @@
           </w:tcPr>
           <w:p>
             <w:pPr>
+              <w:keepNext/>
               <w:spacing w:before="79" w:after="79" w:line="276" w:lineRule="auto"/>
               <w:jc w:val="center"/>
             </w:pPr>
@@ -14313,6 +14471,7 @@
           </w:tcPr>
           <w:p>
             <w:pPr>
+              <w:keepNext/>
               <w:spacing w:before="79" w:after="79" w:line="276" w:lineRule="auto"/>
             </w:pPr>
             <w:r>
@@ -14331,6 +14490,7 @@
           </w:tcPr>
           <w:p>
             <w:pPr>
+              <w:keepNext/>
               <w:spacing w:before="79" w:after="79" w:line="276" w:lineRule="auto"/>
               <w:jc w:val="center"/>
             </w:pPr>
@@ -14350,6 +14510,7 @@
           </w:tcPr>
           <w:p>
             <w:pPr>
+              <w:keepNext/>
               <w:spacing w:before="79" w:after="79" w:line="276" w:lineRule="auto"/>
             </w:pPr>
           </w:p>
@@ -14361,6 +14522,7 @@
           </w:tcPr>
           <w:p>
             <w:pPr>
+              <w:keepNext/>
               <w:spacing w:before="79" w:after="79" w:line="276" w:lineRule="auto"/>
               <w:jc w:val="center"/>
             </w:pPr>
@@ -14380,6 +14542,7 @@
           </w:tcPr>
           <w:p>
             <w:pPr>
+              <w:keepNext/>
               <w:spacing w:before="79" w:after="79" w:line="276" w:lineRule="auto"/>
               <w:jc w:val="center"/>
             </w:pPr>
@@ -14399,6 +14562,7 @@
           </w:tcPr>
           <w:p>
             <w:pPr>
+              <w:keepNext/>
               <w:spacing w:before="79" w:after="79" w:line="276" w:lineRule="auto"/>
               <w:jc w:val="center"/>
             </w:pPr>
@@ -14418,6 +14582,7 @@
           </w:tcPr>
           <w:p>
             <w:pPr>
+              <w:keepNext/>
               <w:spacing w:before="79" w:after="79" w:line="276" w:lineRule="auto"/>
               <w:jc w:val="center"/>
             </w:pPr>
@@ -14442,6 +14607,7 @@
           </w:tcPr>
           <w:p>
             <w:pPr>
+              <w:keepNext/>
               <w:spacing w:before="79" w:after="79" w:line="276" w:lineRule="auto"/>
             </w:pPr>
             <w:r>
@@ -14460,6 +14626,7 @@
           </w:tcPr>
           <w:p>
             <w:pPr>
+              <w:keepNext/>
               <w:spacing w:before="79" w:after="79" w:line="276" w:lineRule="auto"/>
               <w:jc w:val="center"/>
             </w:pPr>
@@ -14479,6 +14646,7 @@
           </w:tcPr>
           <w:p>
             <w:pPr>
+              <w:keepNext/>
               <w:spacing w:before="79" w:after="79" w:line="276" w:lineRule="auto"/>
             </w:pPr>
           </w:p>
@@ -14490,6 +14658,7 @@
           </w:tcPr>
           <w:p>
             <w:pPr>
+              <w:keepNext/>
               <w:spacing w:before="79" w:after="79" w:line="276" w:lineRule="auto"/>
               <w:jc w:val="center"/>
             </w:pPr>
@@ -14509,6 +14678,7 @@
           </w:tcPr>
           <w:p>
             <w:pPr>
+              <w:keepNext/>
               <w:spacing w:before="79" w:after="79" w:line="276" w:lineRule="auto"/>
               <w:jc w:val="center"/>
             </w:pPr>
@@ -14528,6 +14698,7 @@
           </w:tcPr>
           <w:p>
             <w:pPr>
+              <w:keepNext/>
               <w:spacing w:before="79" w:after="79" w:line="276" w:lineRule="auto"/>
               <w:jc w:val="center"/>
             </w:pPr>
@@ -14547,6 +14718,7 @@
           </w:tcPr>
           <w:p>
             <w:pPr>
+              <w:keepNext/>
               <w:spacing w:before="79" w:after="79" w:line="276" w:lineRule="auto"/>
               <w:jc w:val="center"/>
             </w:pPr>
@@ -14571,6 +14743,7 @@
           </w:tcPr>
           <w:p>
             <w:pPr>
+              <w:keepNext/>
               <w:spacing w:before="79" w:after="79" w:line="276" w:lineRule="auto"/>
             </w:pPr>
             <w:r>
@@ -14589,6 +14762,7 @@
           </w:tcPr>
           <w:p>
             <w:pPr>
+              <w:keepNext/>
               <w:spacing w:before="79" w:after="79" w:line="276" w:lineRule="auto"/>
               <w:jc w:val="center"/>
             </w:pPr>
@@ -14608,6 +14782,7 @@
           </w:tcPr>
           <w:p>
             <w:pPr>
+              <w:keepNext/>
               <w:spacing w:before="79" w:after="79" w:line="276" w:lineRule="auto"/>
               <w:jc w:val="center"/>
             </w:pPr>
@@ -14627,6 +14802,7 @@
           </w:tcPr>
           <w:p>
             <w:pPr>
+              <w:keepNext/>
               <w:spacing w:before="79" w:after="79" w:line="276" w:lineRule="auto"/>
               <w:jc w:val="center"/>
             </w:pPr>
@@ -14646,6 +14822,7 @@
           </w:tcPr>
           <w:p>
             <w:pPr>
+              <w:keepNext/>
               <w:spacing w:before="79" w:after="79" w:line="276" w:lineRule="auto"/>
               <w:jc w:val="center"/>
             </w:pPr>
@@ -14665,6 +14842,7 @@
           </w:tcPr>
           <w:p>
             <w:pPr>
+              <w:keepNext/>
               <w:spacing w:before="79" w:after="79" w:line="276" w:lineRule="auto"/>
               <w:jc w:val="center"/>
             </w:pPr>
@@ -14684,6 +14862,7 @@
           </w:tcPr>
           <w:p>
             <w:pPr>
+              <w:keepNext/>
               <w:spacing w:before="79" w:after="79" w:line="276" w:lineRule="auto"/>
               <w:jc w:val="center"/>
             </w:pPr>
@@ -14708,6 +14887,7 @@
           </w:tcPr>
           <w:p>
             <w:pPr>
+              <w:keepNext/>
               <w:spacing w:before="79" w:after="79" w:line="276" w:lineRule="auto"/>
             </w:pPr>
             <w:r>
@@ -14726,6 +14906,7 @@
           </w:tcPr>
           <w:p>
             <w:pPr>
+              <w:keepNext/>
               <w:spacing w:before="79" w:after="79" w:line="276" w:lineRule="auto"/>
               <w:jc w:val="center"/>
             </w:pPr>
@@ -14745,6 +14926,7 @@
           </w:tcPr>
           <w:p>
             <w:pPr>
+              <w:keepNext/>
               <w:spacing w:before="79" w:after="79" w:line="276" w:lineRule="auto"/>
               <w:jc w:val="center"/>
             </w:pPr>
@@ -14764,6 +14946,7 @@
           </w:tcPr>
           <w:p>
             <w:pPr>
+              <w:keepNext/>
               <w:spacing w:before="79" w:after="79" w:line="276" w:lineRule="auto"/>
               <w:jc w:val="center"/>
             </w:pPr>
@@ -14783,6 +14966,7 @@
           </w:tcPr>
           <w:p>
             <w:pPr>
+              <w:keepNext/>
               <w:spacing w:before="79" w:after="79" w:line="276" w:lineRule="auto"/>
               <w:jc w:val="center"/>
             </w:pPr>
@@ -14802,6 +14986,7 @@
           </w:tcPr>
           <w:p>
             <w:pPr>
+              <w:keepNext/>
               <w:spacing w:before="79" w:after="79" w:line="276" w:lineRule="auto"/>
               <w:jc w:val="center"/>
             </w:pPr>
@@ -14821,6 +15006,7 @@
           </w:tcPr>
           <w:p>
             <w:pPr>
+              <w:keepNext/>
               <w:spacing w:before="79" w:after="79" w:line="276" w:lineRule="auto"/>
               <w:jc w:val="center"/>
             </w:pPr>
@@ -14845,6 +15031,7 @@
           </w:tcPr>
           <w:p>
             <w:pPr>
+              <w:keepNext/>
               <w:spacing w:before="79" w:after="79" w:line="276" w:lineRule="auto"/>
             </w:pPr>
             <w:r>
@@ -14863,6 +15050,7 @@
           </w:tcPr>
           <w:p>
             <w:pPr>
+              <w:keepNext/>
               <w:spacing w:before="79" w:after="79" w:line="276" w:lineRule="auto"/>
               <w:jc w:val="center"/>
             </w:pPr>
@@ -14882,6 +15070,7 @@
           </w:tcPr>
           <w:p>
             <w:pPr>
+              <w:keepNext/>
               <w:spacing w:before="79" w:after="79" w:line="276" w:lineRule="auto"/>
               <w:jc w:val="center"/>
             </w:pPr>
@@ -14901,6 +15090,7 @@
           </w:tcPr>
           <w:p>
             <w:pPr>
+              <w:keepNext/>
               <w:spacing w:before="79" w:after="79" w:line="276" w:lineRule="auto"/>
               <w:jc w:val="center"/>
             </w:pPr>
@@ -14920,6 +15110,7 @@
           </w:tcPr>
           <w:p>
             <w:pPr>
+              <w:keepNext/>
               <w:spacing w:before="79" w:after="79" w:line="276" w:lineRule="auto"/>
               <w:jc w:val="center"/>
             </w:pPr>
@@ -14939,6 +15130,7 @@
           </w:tcPr>
           <w:p>
             <w:pPr>
+              <w:keepNext/>
               <w:spacing w:before="79" w:after="79" w:line="276" w:lineRule="auto"/>
               <w:jc w:val="center"/>
             </w:pPr>
@@ -14958,6 +15150,7 @@
           </w:tcPr>
           <w:p>
             <w:pPr>
+              <w:keepNext/>
               <w:spacing w:before="79" w:after="79" w:line="276" w:lineRule="auto"/>
               <w:jc w:val="center"/>
             </w:pPr>
@@ -14982,6 +15175,7 @@
           </w:tcPr>
           <w:p>
             <w:pPr>
+              <w:keepNext/>
               <w:spacing w:before="79" w:after="79" w:line="276" w:lineRule="auto"/>
             </w:pPr>
             <w:r>
@@ -15000,6 +15194,7 @@
           </w:tcPr>
           <w:p>
             <w:pPr>
+              <w:keepNext/>
               <w:spacing w:before="79" w:after="79" w:line="276" w:lineRule="auto"/>
               <w:jc w:val="center"/>
             </w:pPr>
@@ -15019,6 +15214,7 @@
           </w:tcPr>
           <w:p>
             <w:pPr>
+              <w:keepNext/>
               <w:spacing w:before="79" w:after="79" w:line="276" w:lineRule="auto"/>
               <w:jc w:val="center"/>
             </w:pPr>
@@ -15038,6 +15234,7 @@
           </w:tcPr>
           <w:p>
             <w:pPr>
+              <w:keepNext/>
               <w:spacing w:before="79" w:after="79" w:line="276" w:lineRule="auto"/>
               <w:jc w:val="center"/>
             </w:pPr>
@@ -15057,6 +15254,7 @@
           </w:tcPr>
           <w:p>
             <w:pPr>
+              <w:keepNext/>
               <w:spacing w:before="79" w:after="79" w:line="276" w:lineRule="auto"/>
               <w:jc w:val="center"/>
             </w:pPr>
@@ -15076,6 +15274,7 @@
           </w:tcPr>
           <w:p>
             <w:pPr>
+              <w:keepNext/>
               <w:spacing w:before="79" w:after="79" w:line="276" w:lineRule="auto"/>
               <w:jc w:val="center"/>
             </w:pPr>
@@ -15095,6 +15294,7 @@
           </w:tcPr>
           <w:p>
             <w:pPr>
+              <w:keepNext/>
               <w:spacing w:before="79" w:after="79" w:line="276" w:lineRule="auto"/>
               <w:jc w:val="center"/>
             </w:pPr>
@@ -15331,6 +15531,7 @@
           </w:tcPr>
           <w:p>
             <w:pPr>
+              <w:keepNext/>
               <w:spacing w:before="79" w:after="79" w:line="276" w:lineRule="auto"/>
             </w:pPr>
             <w:r>
@@ -15352,6 +15553,7 @@
           </w:tcPr>
           <w:p>
             <w:pPr>
+              <w:keepNext/>
               <w:spacing w:before="79" w:after="79" w:line="276" w:lineRule="auto"/>
             </w:pPr>
             <w:r>
@@ -15373,6 +15575,7 @@
           </w:tcPr>
           <w:p>
             <w:pPr>
+              <w:keepNext/>
               <w:spacing w:before="79" w:after="79" w:line="276" w:lineRule="auto"/>
               <w:jc w:val="center"/>
             </w:pPr>
@@ -15395,6 +15598,7 @@
           </w:tcPr>
           <w:p>
             <w:pPr>
+              <w:keepNext/>
               <w:spacing w:before="79" w:after="79" w:line="276" w:lineRule="auto"/>
               <w:jc w:val="center"/>
             </w:pPr>
@@ -15417,6 +15621,7 @@
           </w:tcPr>
           <w:p>
             <w:pPr>
+              <w:keepNext/>
               <w:spacing w:before="79" w:after="79" w:line="276" w:lineRule="auto"/>
               <w:jc w:val="center"/>
             </w:pPr>
@@ -15439,6 +15644,7 @@
           </w:tcPr>
           <w:p>
             <w:pPr>
+              <w:keepNext/>
               <w:spacing w:before="79" w:after="79" w:line="276" w:lineRule="auto"/>
               <w:jc w:val="center"/>
             </w:pPr>
@@ -15461,6 +15667,7 @@
           </w:tcPr>
           <w:p>
             <w:pPr>
+              <w:keepNext/>
               <w:spacing w:before="79" w:after="79" w:line="276" w:lineRule="auto"/>
               <w:jc w:val="center"/>
             </w:pPr>
@@ -15483,6 +15690,7 @@
           </w:tcPr>
           <w:p>
             <w:pPr>
+              <w:keepNext/>
               <w:spacing w:before="79" w:after="79" w:line="276" w:lineRule="auto"/>
               <w:jc w:val="center"/>
             </w:pPr>
@@ -15505,6 +15713,7 @@
           </w:tcPr>
           <w:p>
             <w:pPr>
+              <w:keepNext/>
               <w:spacing w:before="79" w:after="79" w:line="276" w:lineRule="auto"/>
               <w:jc w:val="center"/>
             </w:pPr>
@@ -15527,6 +15736,7 @@
           </w:tcPr>
           <w:p>
             <w:pPr>
+              <w:keepNext/>
               <w:spacing w:before="79" w:after="79" w:line="276" w:lineRule="auto"/>
               <w:jc w:val="center"/>
             </w:pPr>
@@ -15553,6 +15763,7 @@
           </w:tcPr>
           <w:p>
             <w:pPr>
+              <w:keepNext/>
               <w:spacing w:before="79" w:after="79" w:line="276" w:lineRule="auto"/>
             </w:pPr>
             <w:r>
@@ -15571,6 +15782,7 @@
           </w:tcPr>
           <w:p>
             <w:pPr>
+              <w:keepNext/>
               <w:spacing w:before="79" w:after="79" w:line="276" w:lineRule="auto"/>
             </w:pPr>
             <w:r>
@@ -15589,6 +15801,7 @@
           </w:tcPr>
           <w:p>
             <w:pPr>
+              <w:keepNext/>
               <w:spacing w:before="79" w:after="79" w:line="276" w:lineRule="auto"/>
               <w:jc w:val="center"/>
             </w:pPr>
@@ -15608,6 +15821,7 @@
           </w:tcPr>
           <w:p>
             <w:pPr>
+              <w:keepNext/>
               <w:spacing w:before="79" w:after="79" w:line="276" w:lineRule="auto"/>
               <w:jc w:val="center"/>
             </w:pPr>
@@ -15627,6 +15841,7 @@
           </w:tcPr>
           <w:p>
             <w:pPr>
+              <w:keepNext/>
               <w:spacing w:before="79" w:after="79" w:line="276" w:lineRule="auto"/>
               <w:jc w:val="center"/>
             </w:pPr>
@@ -15646,6 +15861,7 @@
           </w:tcPr>
           <w:p>
             <w:pPr>
+              <w:keepNext/>
               <w:spacing w:before="79" w:after="79" w:line="276" w:lineRule="auto"/>
               <w:jc w:val="center"/>
             </w:pPr>
@@ -15665,6 +15881,7 @@
           </w:tcPr>
           <w:p>
             <w:pPr>
+              <w:keepNext/>
               <w:spacing w:before="79" w:after="79" w:line="276" w:lineRule="auto"/>
               <w:jc w:val="center"/>
             </w:pPr>
@@ -15684,6 +15901,7 @@
           </w:tcPr>
           <w:p>
             <w:pPr>
+              <w:keepNext/>
               <w:spacing w:before="79" w:after="79" w:line="276" w:lineRule="auto"/>
               <w:jc w:val="center"/>
             </w:pPr>
@@ -15703,6 +15921,7 @@
           </w:tcPr>
           <w:p>
             <w:pPr>
+              <w:keepNext/>
               <w:spacing w:before="79" w:after="79" w:line="276" w:lineRule="auto"/>
               <w:jc w:val="center"/>
             </w:pPr>
@@ -15722,6 +15941,7 @@
           </w:tcPr>
           <w:p>
             <w:pPr>
+              <w:keepNext/>
               <w:spacing w:before="79" w:after="79" w:line="276" w:lineRule="auto"/>
               <w:jc w:val="center"/>
             </w:pPr>
@@ -15746,6 +15966,7 @@
           </w:tcPr>
           <w:p>
             <w:pPr>
+              <w:keepNext/>
               <w:spacing w:before="79" w:after="79" w:line="276" w:lineRule="auto"/>
             </w:pPr>
             <w:r>
@@ -15764,6 +15985,7 @@
           </w:tcPr>
           <w:p>
             <w:pPr>
+              <w:keepNext/>
               <w:spacing w:before="79" w:after="79" w:line="276" w:lineRule="auto"/>
             </w:pPr>
             <w:r>
@@ -15782,6 +16004,7 @@
           </w:tcPr>
           <w:p>
             <w:pPr>
+              <w:keepNext/>
               <w:spacing w:before="79" w:after="79" w:line="276" w:lineRule="auto"/>
               <w:jc w:val="center"/>
             </w:pPr>
@@ -15801,6 +16024,7 @@
           </w:tcPr>
           <w:p>
             <w:pPr>
+              <w:keepNext/>
               <w:spacing w:before="79" w:after="79" w:line="276" w:lineRule="auto"/>
               <w:jc w:val="center"/>
             </w:pPr>
@@ -15820,6 +16044,7 @@
           </w:tcPr>
           <w:p>
             <w:pPr>
+              <w:keepNext/>
               <w:spacing w:before="79" w:after="79" w:line="276" w:lineRule="auto"/>
               <w:jc w:val="center"/>
             </w:pPr>
@@ -15839,6 +16064,7 @@
           </w:tcPr>
           <w:p>
             <w:pPr>
+              <w:keepNext/>
               <w:spacing w:before="79" w:after="79" w:line="276" w:lineRule="auto"/>
               <w:jc w:val="center"/>
             </w:pPr>
@@ -15858,6 +16084,7 @@
           </w:tcPr>
           <w:p>
             <w:pPr>
+              <w:keepNext/>
               <w:spacing w:before="79" w:after="79" w:line="276" w:lineRule="auto"/>
               <w:jc w:val="center"/>
             </w:pPr>
@@ -15877,6 +16104,7 @@
           </w:tcPr>
           <w:p>
             <w:pPr>
+              <w:keepNext/>
               <w:spacing w:before="79" w:after="79" w:line="276" w:lineRule="auto"/>
               <w:jc w:val="center"/>
             </w:pPr>
@@ -15896,6 +16124,7 @@
           </w:tcPr>
           <w:p>
             <w:pPr>
+              <w:keepNext/>
               <w:spacing w:before="79" w:after="79" w:line="276" w:lineRule="auto"/>
               <w:jc w:val="center"/>
             </w:pPr>
@@ -15915,6 +16144,7 @@
           </w:tcPr>
           <w:p>
             <w:pPr>
+              <w:keepNext/>
               <w:spacing w:before="79" w:after="79" w:line="276" w:lineRule="auto"/>
               <w:jc w:val="center"/>
             </w:pPr>
@@ -15939,6 +16169,7 @@
           </w:tcPr>
           <w:p>
             <w:pPr>
+              <w:keepNext/>
               <w:spacing w:before="79" w:after="79" w:line="276" w:lineRule="auto"/>
             </w:pPr>
             <w:r>
@@ -15957,6 +16188,7 @@
           </w:tcPr>
           <w:p>
             <w:pPr>
+              <w:keepNext/>
               <w:spacing w:before="79" w:after="79" w:line="276" w:lineRule="auto"/>
             </w:pPr>
             <w:r>
@@ -15975,6 +16207,7 @@
           </w:tcPr>
           <w:p>
             <w:pPr>
+              <w:keepNext/>
               <w:spacing w:before="79" w:after="79" w:line="276" w:lineRule="auto"/>
               <w:jc w:val="center"/>
             </w:pPr>
@@ -15994,6 +16227,7 @@
           </w:tcPr>
           <w:p>
             <w:pPr>
+              <w:keepNext/>
               <w:spacing w:before="79" w:after="79" w:line="276" w:lineRule="auto"/>
               <w:jc w:val="center"/>
             </w:pPr>
@@ -16013,6 +16247,7 @@
           </w:tcPr>
           <w:p>
             <w:pPr>
+              <w:keepNext/>
               <w:spacing w:before="79" w:after="79" w:line="276" w:lineRule="auto"/>
               <w:jc w:val="center"/>
             </w:pPr>
@@ -16032,6 +16267,7 @@
           </w:tcPr>
           <w:p>
             <w:pPr>
+              <w:keepNext/>
               <w:spacing w:before="79" w:after="79" w:line="276" w:lineRule="auto"/>
               <w:jc w:val="center"/>
             </w:pPr>
@@ -16051,6 +16287,7 @@
           </w:tcPr>
           <w:p>
             <w:pPr>
+              <w:keepNext/>
               <w:spacing w:before="79" w:after="79" w:line="276" w:lineRule="auto"/>
               <w:jc w:val="center"/>
             </w:pPr>
@@ -16070,6 +16307,7 @@
           </w:tcPr>
           <w:p>
             <w:pPr>
+              <w:keepNext/>
               <w:spacing w:before="79" w:after="79" w:line="276" w:lineRule="auto"/>
               <w:jc w:val="center"/>
             </w:pPr>
@@ -16089,6 +16327,7 @@
           </w:tcPr>
           <w:p>
             <w:pPr>
+              <w:keepNext/>
               <w:spacing w:before="79" w:after="79" w:line="276" w:lineRule="auto"/>
               <w:jc w:val="center"/>
             </w:pPr>
@@ -16108,6 +16347,7 @@
           </w:tcPr>
           <w:p>
             <w:pPr>
+              <w:keepNext/>
               <w:spacing w:before="79" w:after="79" w:line="276" w:lineRule="auto"/>
               <w:jc w:val="center"/>
             </w:pPr>
@@ -16417,6 +16657,7 @@
           </w:tcPr>
           <w:p>
             <w:pPr>
+              <w:keepNext/>
               <w:spacing w:before="79" w:after="79" w:line="276" w:lineRule="auto"/>
             </w:pPr>
             <w:r>
@@ -16438,6 +16679,7 @@
           </w:tcPr>
           <w:p>
             <w:pPr>
+              <w:keepNext/>
               <w:spacing w:before="79" w:after="79" w:line="276" w:lineRule="auto"/>
               <w:jc w:val="center"/>
             </w:pPr>
@@ -16460,6 +16702,7 @@
           </w:tcPr>
           <w:p>
             <w:pPr>
+              <w:keepNext/>
               <w:spacing w:before="79" w:after="79" w:line="276" w:lineRule="auto"/>
               <w:jc w:val="center"/>
             </w:pPr>
@@ -16482,6 +16725,7 @@
           </w:tcPr>
           <w:p>
             <w:pPr>
+              <w:keepNext/>
               <w:spacing w:before="79" w:after="79" w:line="276" w:lineRule="auto"/>
               <w:jc w:val="center"/>
             </w:pPr>
@@ -16504,6 +16748,7 @@
           </w:tcPr>
           <w:p>
             <w:pPr>
+              <w:keepNext/>
               <w:spacing w:before="79" w:after="79" w:line="276" w:lineRule="auto"/>
               <w:jc w:val="center"/>
             </w:pPr>
@@ -16526,6 +16771,7 @@
           </w:tcPr>
           <w:p>
             <w:pPr>
+              <w:keepNext/>
               <w:spacing w:before="79" w:after="79" w:line="276" w:lineRule="auto"/>
               <w:jc w:val="center"/>
             </w:pPr>
@@ -16548,6 +16794,7 @@
           </w:tcPr>
           <w:p>
             <w:pPr>
+              <w:keepNext/>
               <w:spacing w:before="79" w:after="79" w:line="276" w:lineRule="auto"/>
               <w:jc w:val="center"/>
             </w:pPr>
@@ -16570,6 +16817,7 @@
           </w:tcPr>
           <w:p>
             <w:pPr>
+              <w:keepNext/>
               <w:spacing w:before="79" w:after="79" w:line="276" w:lineRule="auto"/>
               <w:jc w:val="center"/>
             </w:pPr>
@@ -16592,6 +16840,7 @@
           </w:tcPr>
           <w:p>
             <w:pPr>
+              <w:keepNext/>
               <w:spacing w:before="79" w:after="79" w:line="276" w:lineRule="auto"/>
               <w:jc w:val="center"/>
             </w:pPr>
@@ -16614,6 +16863,7 @@
           </w:tcPr>
           <w:p>
             <w:pPr>
+              <w:keepNext/>
               <w:spacing w:before="79" w:after="79" w:line="276" w:lineRule="auto"/>
               <w:jc w:val="center"/>
             </w:pPr>
@@ -16636,6 +16886,7 @@
           </w:tcPr>
           <w:p>
             <w:pPr>
+              <w:keepNext/>
               <w:spacing w:before="79" w:after="79" w:line="276" w:lineRule="auto"/>
               <w:jc w:val="center"/>
             </w:pPr>
@@ -16658,6 +16909,7 @@
           </w:tcPr>
           <w:p>
             <w:pPr>
+              <w:keepNext/>
               <w:spacing w:before="79" w:after="79" w:line="276" w:lineRule="auto"/>
               <w:jc w:val="center"/>
             </w:pPr>
@@ -16680,6 +16932,7 @@
           </w:tcPr>
           <w:p>
             <w:pPr>
+              <w:keepNext/>
               <w:spacing w:before="79" w:after="79" w:line="276" w:lineRule="auto"/>
               <w:jc w:val="center"/>
             </w:pPr>
@@ -16702,6 +16955,7 @@
           </w:tcPr>
           <w:p>
             <w:pPr>
+              <w:keepNext/>
               <w:spacing w:before="79" w:after="79" w:line="276" w:lineRule="auto"/>
               <w:jc w:val="center"/>
             </w:pPr>
@@ -16724,6 +16978,7 @@
           </w:tcPr>
           <w:p>
             <w:pPr>
+              <w:keepNext/>
               <w:spacing w:before="79" w:after="79" w:line="276" w:lineRule="auto"/>
               <w:jc w:val="center"/>
             </w:pPr>
@@ -16750,6 +17005,7 @@
           </w:tcPr>
           <w:p>
             <w:pPr>
+              <w:keepNext/>
               <w:spacing w:before="79" w:after="79" w:line="276" w:lineRule="auto"/>
             </w:pPr>
             <w:r>
@@ -16768,6 +17024,7 @@
           </w:tcPr>
           <w:p>
             <w:pPr>
+              <w:keepNext/>
               <w:spacing w:before="79" w:after="79" w:line="276" w:lineRule="auto"/>
               <w:jc w:val="center"/>
             </w:pPr>
@@ -16787,6 +17044,7 @@
           </w:tcPr>
           <w:p>
             <w:pPr>
+              <w:keepNext/>
               <w:spacing w:before="79" w:after="79" w:line="276" w:lineRule="auto"/>
               <w:jc w:val="center"/>
             </w:pPr>
@@ -16806,6 +17064,7 @@
           </w:tcPr>
           <w:p>
             <w:pPr>
+              <w:keepNext/>
               <w:spacing w:before="79" w:after="79" w:line="276" w:lineRule="auto"/>
               <w:jc w:val="center"/>
             </w:pPr>
@@ -16825,6 +17084,7 @@
           </w:tcPr>
           <w:p>
             <w:pPr>
+              <w:keepNext/>
               <w:spacing w:before="79" w:after="79" w:line="276" w:lineRule="auto"/>
               <w:jc w:val="center"/>
             </w:pPr>
@@ -16844,6 +17104,7 @@
           </w:tcPr>
           <w:p>
             <w:pPr>
+              <w:keepNext/>
               <w:spacing w:before="79" w:after="79" w:line="276" w:lineRule="auto"/>
               <w:jc w:val="center"/>
             </w:pPr>
@@ -16863,6 +17124,7 @@
           </w:tcPr>
           <w:p>
             <w:pPr>
+              <w:keepNext/>
               <w:spacing w:before="79" w:after="79" w:line="276" w:lineRule="auto"/>
               <w:jc w:val="center"/>
             </w:pPr>
@@ -16882,6 +17144,7 @@
           </w:tcPr>
           <w:p>
             <w:pPr>
+              <w:keepNext/>
               <w:spacing w:before="79" w:after="79" w:line="276" w:lineRule="auto"/>
               <w:jc w:val="center"/>
             </w:pPr>
@@ -16901,6 +17164,7 @@
           </w:tcPr>
           <w:p>
             <w:pPr>
+              <w:keepNext/>
               <w:spacing w:before="79" w:after="79" w:line="276" w:lineRule="auto"/>
               <w:jc w:val="center"/>
             </w:pPr>
@@ -16920,6 +17184,7 @@
           </w:tcPr>
           <w:p>
             <w:pPr>
+              <w:keepNext/>
               <w:spacing w:before="79" w:after="79" w:line="276" w:lineRule="auto"/>
               <w:jc w:val="center"/>
             </w:pPr>
@@ -16939,6 +17204,7 @@
           </w:tcPr>
           <w:p>
             <w:pPr>
+              <w:keepNext/>
               <w:spacing w:before="79" w:after="79" w:line="276" w:lineRule="auto"/>
               <w:jc w:val="center"/>
             </w:pPr>
@@ -16958,6 +17224,7 @@
           </w:tcPr>
           <w:p>
             <w:pPr>
+              <w:keepNext/>
               <w:spacing w:before="79" w:after="79" w:line="276" w:lineRule="auto"/>
               <w:jc w:val="center"/>
             </w:pPr>
@@ -16977,6 +17244,7 @@
           </w:tcPr>
           <w:p>
             <w:pPr>
+              <w:keepNext/>
               <w:spacing w:before="79" w:after="79" w:line="276" w:lineRule="auto"/>
               <w:jc w:val="center"/>
             </w:pPr>
@@ -16996,6 +17264,7 @@
           </w:tcPr>
           <w:p>
             <w:pPr>
+              <w:keepNext/>
               <w:spacing w:before="79" w:after="79" w:line="276" w:lineRule="auto"/>
               <w:jc w:val="center"/>
             </w:pPr>
@@ -17015,6 +17284,7 @@
           </w:tcPr>
           <w:p>
             <w:pPr>
+              <w:keepNext/>
               <w:spacing w:before="79" w:after="79" w:line="276" w:lineRule="auto"/>
               <w:jc w:val="center"/>
             </w:pPr>

</xml_diff>